<commit_message>
feat(auditoria-lgpd-2026): atualizar matriz e instrumentos da fiscalização
- sincroniza a matriz de planejamento com os códigos atuais do survey, removendo referências a campos [comment] inexistentes;

- ajusta a renderização DOCX de questões de levantamento, sem bloco de riscos ou coluna de critérios, e aplica Arial 10 pt em negrito às questões;

- consolida o questionário LGPD 2026 em Markdown, LSS, DOCX e PDF, incluindo justificativas, evidências e questões de monitoramento;

- documenta a geração determinística dos artefatos e inclui o script auxiliar de produção do guia do questionário.
</commit_message>
<xml_diff>
--- a/01-Planejamento/02-Matriz_de_Planejamento/matriz_planejamento.docx
+++ b/01-Planejamento/02-Matriz_de_Planejamento/matriz_planejamento.docx
@@ -141,6 +141,13 @@
               </w:rPr>
             </w:pPr>
             <w:r>
+              <w:rPr>
+                <w:b/>
+                <w:bCs/>
+                <w:rFonts w:ascii="Arial" w:hAnsi="Arial" w:cs="Arial" w:eastAsia="Arial"/>
+                <w:sz w:val="20"/>
+                <w:szCs w:val="20"/>
+              </w:rPr>
               <w:t>Q1: A organização conduziu iniciativas preparatórias de adequação à LGPD, instituiu programa de governança em privacidade e designou formalmente o Encarregado pelo tratamento de dados pessoais (DPO), divulgando seus contatos em seu portal oficial?</w:t>
             </w:r>
           </w:p>
@@ -162,7 +169,7 @@
             </w:pPr>
             <w:r>
               <w:rPr>
-                <w:rFonts w:ascii="Arial" w:hAnsi="Arial" w:cs="Arial"/>
+                <w:rFonts w:ascii="Arial" w:hAnsi="Arial" w:cs="Arial" w:eastAsia="Arial"/>
                 <w:sz w:val="20"/>
                 <w:szCs w:val="20"/>
               </w:rPr>
@@ -187,7 +194,7 @@
             </w:pPr>
             <w:r>
               <w:rPr>
-                <w:rFonts w:ascii="Arial" w:hAnsi="Arial" w:cs="Arial"/>
+                <w:rFonts w:ascii="Arial" w:hAnsi="Arial" w:cs="Arial" w:eastAsia="Arial"/>
                 <w:sz w:val="20"/>
                 <w:szCs w:val="20"/>
               </w:rPr>
@@ -212,7 +219,7 @@
             </w:pPr>
             <w:r>
               <w:rPr>
-                <w:rFonts w:ascii="Arial" w:hAnsi="Arial" w:cs="Arial"/>
+                <w:rFonts w:ascii="Arial" w:hAnsi="Arial" w:cs="Arial" w:eastAsia="Arial"/>
                 <w:sz w:val="20"/>
                 <w:szCs w:val="20"/>
               </w:rPr>
@@ -237,7 +244,7 @@
             </w:pPr>
             <w:r>
               <w:rPr>
-                <w:rFonts w:ascii="Arial" w:hAnsi="Arial" w:cs="Arial"/>
+                <w:rFonts w:ascii="Arial" w:hAnsi="Arial" w:cs="Arial" w:eastAsia="Arial"/>
                 <w:sz w:val="20"/>
                 <w:szCs w:val="20"/>
               </w:rPr>
@@ -640,7 +647,7 @@
                 <w:sz w:val="18"/>
                 <w:szCs w:val="18"/>
               </w:rPr>
-              <w:t>IR1: Resposta sobre a execução de iniciativas preparatórias e a consideração dos encaminhamentos do Acórdão nº 3931/2025, acompanhada da comprovação documental do plano de ação e do programa de governança em privacidade; [F1, F2, Q21, Q21[comment], Q23, Q23[comment], Q211, Q212]</w:t>
+              <w:t>IR1: Resposta sobre a execução de iniciativas preparatórias, a consideração dos encaminhamentos do Acórdão nº 3931/2025 e a elaboração e o registro do Plano de Ação determinado no item 1.1, acompanhada da comprovação documental do plano e do programa de governança em privacidade; [F1, F2, Q21, Q23, Q24, Q211evi, Q212evi]</w:t>
             </w:r>
           </w:p>
           <w:p ns2:paraId="1DD0E491" ns2:textId="77777777">
@@ -663,7 +670,7 @@
                 <w:sz w:val="18"/>
                 <w:szCs w:val="18"/>
               </w:rPr>
-              <w:t>IR2: Resposta e ato formal de nomeação do Encarregado de Dados publicado em diário oficial; [F1, F2, Q41[SQ004], Q414]</w:t>
+              <w:t>IR2: Resposta e ato formal de nomeação do Encarregado de Dados publicado em diário oficial; [F1, F2, Q41[SQ004], Q414evi]</w:t>
             </w:r>
           </w:p>
           <w:p ns2:paraId="1DD0E491" ns2:textId="77777777">
@@ -871,6 +878,81 @@
               <w:t>C7: Acórdão nº 3931/2025 do Plenário do TCE-RJ (Processo TCE-RJ nº 217.899-0/2024), Voto do Relator, item 1.3 — Determinação aos jurisdicionados para publicar em seu portal institucional, de forma clara e objetiva, a identidade e informações de contato do encarregado pelo tratamento de dados pessoais.</w:t>
             </w:r>
           </w:p>
+          <w:p ns2:paraId="2667BB09" ns2:textId="2C1623C1">
+            <w:pPr>
+              <w:pStyle w:val="1010"/>
+              <w:pBdr/>
+              <w:spacing w:after="120"/>
+              <w:ind/>
+              <w:jc w:val="both"/>
+              <w:rPr>
+                <w:bCs/>
+                <w:color w:val="auto"/>
+                <w:sz w:val="18"/>
+                <w:szCs w:val="18"/>
+                <w:vertAlign w:val="superscript"/>
+              </w:rPr>
+            </w:pPr>
+            <w:r>
+              <w:rPr>
+                <w:bCs/>
+                <w:color w:val="auto"/>
+                <w:sz w:val="18"/>
+                <w:szCs w:val="18"/>
+              </w:rPr>
+              <w:t>C8: Guia do Framework de Privacidade e Segurança da Informação — PPSI 2.0, medida 0.10 — Orienta instituir e implementar Programa de Governança em Privacidade com ações, políticas, normas, procedimentos, papéis, responsabilidades, prazos, controles, indicadores e revisão periódica.</w:t>
+            </w:r>
+          </w:p>
+          <w:p ns2:paraId="2667BB09" ns2:textId="2C1623C1">
+            <w:pPr>
+              <w:pStyle w:val="1010"/>
+              <w:pBdr/>
+              <w:spacing w:after="120"/>
+              <w:ind/>
+              <w:jc w:val="both"/>
+              <w:rPr>
+                <w:bCs/>
+                <w:color w:val="auto"/>
+                <w:sz w:val="18"/>
+                <w:szCs w:val="18"/>
+                <w:vertAlign w:val="superscript"/>
+              </w:rPr>
+            </w:pPr>
+            <w:r>
+              <w:rPr>
+                <w:bCs/>
+                <w:color w:val="auto"/>
+                <w:sz w:val="18"/>
+                <w:szCs w:val="18"/>
+              </w:rPr>
+              <w:t>C9: Guia do Framework de Privacidade e Segurança da Informação — PPSI 2.0, medida 0.4 — Orienta designar formalmente o Encarregado pelo tratamento de dados pessoais e respectivo substituto.</w:t>
+            </w:r>
+          </w:p>
+          <w:p ns2:paraId="2667BB09" ns2:textId="2C1623C1">
+            <w:pPr>
+              <w:pStyle w:val="1010"/>
+              <w:pBdr/>
+              <w:spacing w:after="120"/>
+              <w:ind/>
+              <w:jc w:val="both"/>
+              <w:rPr>
+                <w:bCs/>
+                <w:color w:val="auto"/>
+                <w:sz w:val="18"/>
+                <w:szCs w:val="18"/>
+                <w:vertAlign w:val="superscript"/>
+              </w:rPr>
+            </w:pPr>
+            <w:r>
+              <w:rPr>
+                <w:bCs/>
+                <w:color w:val="auto"/>
+                <w:sz w:val="18"/>
+                <w:szCs w:val="18"/>
+              </w:rPr>
+              <w:t>C10: Guia do Framework de Privacidade e Segurança da Informação — PPSI 2.0, medida 21.4 — Orienta divulgar publicamente e manter atualizadas a identidade e as informações de contato do Encarregado e de seu substituto, em local de destaque e fácil acesso no sítio eletrônico.</w:t>
+            </w:r>
+          </w:p>
         </w:tc>
         <w:tc>
           <w:tcPr>
@@ -899,7 +981,7 @@
                 <w:sz w:val="18"/>
                 <w:szCs w:val="18"/>
               </w:rPr>
-              <w:t>P1: Verificar nas respostas às questões Q21 e Q23 se a organização declarou ter realizado iniciativas preparatórias, elaborado plano de ação ou programa de governança em privacidade e considerado os encaminhamentos aplicáveis do Acórdão nº 3931/2025; [IR1]</w:t>
+              <w:t>P1: Verificar nas respostas às questões Q21, Q23 e Q24 se a organização declarou ter realizado iniciativas preparatórias, elaborado plano de ação ou programa de governança em privacidade, considerado os encaminhamentos aplicáveis do Acórdão nº 3931/2025 e elaborado e registrado o Plano de Ação no prazo determinado; [IR1]</w:t>
             </w:r>
           </w:p>
           <w:p ns2:paraId="4C6E5B2E" ns2:textId="42100C78">
@@ -923,7 +1005,7 @@
                 <w:sz w:val="18"/>
                 <w:szCs w:val="18"/>
               </w:rPr>
-              <w:t>P1.1: Examinar os documentos submetidos nos itens Q211 e Q212 para avaliar sua autenticidade aparente, aprovação, vigência e aderência mínima ao escopo declarado, incluindo ações, responsáveis e prazos para adequação à LGPD; [IR1]</w:t>
+              <w:t>P1.1: Examinar os documentos submetidos nos itens Q211evi e Q212evi para avaliar sua autenticidade aparente, aprovação, vigência e aderência mínima ao escopo declarado, incluindo ações, responsáveis e prazos para adequação à LGPD; [IR1]</w:t>
             </w:r>
           </w:p>
           <w:p ns2:paraId="4C6E5B2E" ns2:textId="42100C78">
@@ -971,7 +1053,7 @@
                 <w:sz w:val="18"/>
                 <w:szCs w:val="18"/>
               </w:rPr>
-              <w:t>P2.1: Examinar o documento submetido no item Q414 para confirmar a existência, validade, autoridade signatária, vigência e publicação oficial do ato de designação do Encarregado; [IR2]</w:t>
+              <w:t>P2.1: Examinar o documento submetido no item Q414evi para confirmar a existência, validade, autoridade signatária, vigência e publicação oficial do ato de designação do Encarregado; [IR2]</w:t>
             </w:r>
           </w:p>
           <w:p ns2:paraId="4C6E5B2E" ns2:textId="42100C78">
@@ -1047,7 +1129,7 @@
                 <w:sz w:val="18"/>
                 <w:szCs w:val="18"/>
               </w:rPr>
-              <w:t>E1: Registro das respostas às questões Q21 e Q23 sobre iniciativas preparatórias, plano de ação, programa de governança em privacidade e consideração dos encaminhamentos do Acórdão nº 3931/2025; [P1]</w:t>
+              <w:t>E1: Registro das respostas às questões Q21, Q23 e Q24 sobre iniciativas preparatórias, plano de ação, programa de governança em privacidade, consideração dos encaminhamentos do Acórdão nº 3931/2025 e elaboração e registro do Plano de Ação determinado no item 1.1; [P1]</w:t>
             </w:r>
           </w:p>
           <w:p ns2:paraId="1E80855F" ns2:textId="1D853748">
@@ -1068,7 +1150,7 @@
                 <w:sz w:val="18"/>
                 <w:szCs w:val="18"/>
               </w:rPr>
-              <w:t>E1.1: Resultado da análise dos documentos Q211 e Q212, com registro de existência, aprovação, vigência, conteúdo mínimo e eventuais inconsistências com a declaração; [P1.1]</w:t>
+              <w:t>E1.1: Resultado da análise dos documentos Q211evi e Q212evi, com registro de existência, aprovação, vigência, conteúdo mínimo e eventuais inconsistências com a declaração; [P1.1]</w:t>
             </w:r>
           </w:p>
           <w:p ns2:paraId="1E80855F" ns2:textId="1D853748">
@@ -1110,7 +1192,7 @@
                 <w:sz w:val="18"/>
                 <w:szCs w:val="18"/>
               </w:rPr>
-              <w:t>E2.1: Resultado da análise do ato Q414, com registro de validade, autoridade signatária, vigência, publicação e eventuais inconsistências com a declaração; [P2.1]</w:t>
+              <w:t>E2.1: Resultado da análise do ato Q414evi, com registro de validade, autoridade signatária, vigência, publicação e eventuais inconsistências com a declaração; [P2.1]</w:t>
             </w:r>
           </w:p>
           <w:p ns2:paraId="1E80855F" ns2:textId="1D853748">
@@ -1182,7 +1264,7 @@
                 <w:sz w:val="18"/>
                 <w:szCs w:val="18"/>
               </w:rPr>
-              <w:t>Deficiência na preparação institucional, governança em privacidade incipiente e ausência ou irregularidade na atuação do Encarregado pelo tratamento de dados pessoais.</w:t>
+              <w:t>Deficiência na preparação institucional em privacidade.</w:t>
             </w:r>
           </w:p>
           <w:p ns2:paraId="11118515" ns2:textId="02403B9E">
@@ -1205,7 +1287,30 @@
                 <w:sz w:val="18"/>
                 <w:szCs w:val="18"/>
               </w:rPr>
-              <w:t>• Ausência de plano de ação ou de programa estruturado de governança em privacidade para direcionar a adequação à LGPD. [R1.1, P1, P1.1, E1, E1.1, C4, C5];</w:t>
+              <w:t>• Ausência de plano de ação ou de programa estruturado de governança em privacidade para direcionar a adequação à LGPD. [R1.1, P1, P1.1, E1, E1.1, C4, C5, C8];</w:t>
+            </w:r>
+          </w:p>
+          <w:p ns2:paraId="11118515" ns2:textId="02403B9E">
+            <w:pPr>
+              <w:pBdr/>
+              <w:spacing w:after="80"/>
+              <w:ind w:firstLine="0" w:left="0"/>
+              <w:jc w:val="both"/>
+              <w:rPr>
+                <w:rFonts w:ascii="Arial" w:hAnsi="Arial" w:cs="Arial"/>
+                <w:sz w:val="18"/>
+                <w:szCs w:val="18"/>
+              </w:rPr>
+            </w:pPr>
+            <w:r>
+              <w:rPr>
+                <w:rFonts w:ascii="Arial" w:hAnsi="Arial" w:cs="Arial"/>
+                <w:b/>
+                <w:bCs/>
+                <w:sz w:val="18"/>
+                <w:szCs w:val="18"/>
+              </w:rPr>
+              <w:t>Ausência ou irregularidade na atuação do Encarregado pelo tratamento de dados pessoais.</w:t>
             </w:r>
           </w:p>
           <w:p ns2:paraId="11118515" ns2:textId="02403B9E">
@@ -1228,7 +1333,7 @@
                 <w:sz w:val="18"/>
                 <w:szCs w:val="18"/>
               </w:rPr>
-              <w:t>• Ausência de designação formal de Encarregado pelo tratamento de dados pessoais (DPO) publicada em veículo oficial. [R1.2, P2, P2.1, E2, E2.1, C1, C3, C6];</w:t>
+              <w:t>• Ausência de designação formal de Encarregado pelo tratamento de dados pessoais (DPO) publicada em veículo oficial. [R1.2, P2, P2.1, E2, E2.1, C1, C3, C6, C9];</w:t>
             </w:r>
           </w:p>
           <w:p ns2:paraId="11118515" ns2:textId="02403B9E">
@@ -1251,7 +1356,7 @@
                 <w:sz w:val="18"/>
                 <w:szCs w:val="18"/>
               </w:rPr>
-              <w:t>• Ausência de divulgação pública da identidade e dos canais de contato do Encarregado no sítio eletrônico oficial. [R1.3, P3, P3.1, E3, E3.1, C2, C3, C7];</w:t>
+              <w:t>• Ausência de divulgação pública da identidade e dos canais de contato do Encarregado no sítio eletrônico oficial. [R1.3, P3, P3.1, E3, E3.1, C2, C3, C7, C10];</w:t>
             </w:r>
           </w:p>
         </w:tc>
@@ -1299,6 +1404,13 @@
               </w:rPr>
             </w:pPr>
             <w:r>
+              <w:rPr>
+                <w:b/>
+                <w:bCs/>
+                <w:rFonts w:ascii="Arial" w:hAnsi="Arial" w:cs="Arial" w:eastAsia="Arial"/>
+                <w:sz w:val="20"/>
+                <w:szCs w:val="20"/>
+              </w:rPr>
               <w:t>Q2: A organização instituiu formalmente políticas de proteção de dados, segurança da informação e classificação da informação, e promoveu capacitação e conscientização periódica de seus colaboradores?</w:t>
             </w:r>
           </w:p>
@@ -1320,7 +1432,7 @@
             </w:pPr>
             <w:r>
               <w:rPr>
-                <w:rFonts w:ascii="Arial" w:hAnsi="Arial" w:cs="Arial"/>
+                <w:rFonts w:ascii="Arial" w:hAnsi="Arial" w:cs="Arial" w:eastAsia="Arial"/>
                 <w:sz w:val="20"/>
                 <w:szCs w:val="20"/>
               </w:rPr>
@@ -1345,7 +1457,7 @@
             </w:pPr>
             <w:r>
               <w:rPr>
-                <w:rFonts w:ascii="Arial" w:hAnsi="Arial" w:cs="Arial"/>
+                <w:rFonts w:ascii="Arial" w:hAnsi="Arial" w:cs="Arial" w:eastAsia="Arial"/>
                 <w:sz w:val="20"/>
                 <w:szCs w:val="20"/>
               </w:rPr>
@@ -1370,7 +1482,7 @@
             </w:pPr>
             <w:r>
               <w:rPr>
-                <w:rFonts w:ascii="Arial" w:hAnsi="Arial" w:cs="Arial"/>
+                <w:rFonts w:ascii="Arial" w:hAnsi="Arial" w:cs="Arial" w:eastAsia="Arial"/>
                 <w:sz w:val="20"/>
                 <w:szCs w:val="20"/>
               </w:rPr>
@@ -1752,7 +1864,7 @@
                 <w:sz w:val="18"/>
                 <w:szCs w:val="18"/>
               </w:rPr>
-              <w:t>IR1: Resposta e ato formal comprobatório da Política de Proteção de Dados Pessoais; [F1, F2, Q41[SQ003], Q411]</w:t>
+              <w:t>IR1: Respostas sobre a formalização e a publicação da Política de Proteção de Dados Pessoais, acompanhadas do ato formal comprobatório; [F1, F2, Q41[SQ003], Q417, Q411evi]</w:t>
             </w:r>
           </w:p>
           <w:p ns2:paraId="1DD0E491" ns2:textId="77777777">
@@ -1775,7 +1887,7 @@
                 <w:sz w:val="18"/>
                 <w:szCs w:val="18"/>
               </w:rPr>
-              <w:t>IR2: Resposta e atos formais comprobatórios da PSI e da Política de Classificação da Informação; [F1, F2, Q41[SQ001], Q41[SQ002], Q412, Q413]</w:t>
+              <w:t>IR2: Respostas sobre a formalização e a publicação da PSI e sobre a formalização da Política de Classificação da Informação, acompanhadas dos atos formais comprobatórios; [F1, F2, Q41[SQ001], Q416, Q41[SQ002], Q412evi, Q413evi]</w:t>
             </w:r>
           </w:p>
           <w:p ns2:paraId="1DD0E491" ns2:textId="77777777">
@@ -1798,7 +1910,7 @@
                 <w:sz w:val="18"/>
                 <w:szCs w:val="18"/>
               </w:rPr>
-              <w:t>IR3: Resposta, declaração de maturidade e Plano de Capacitação em proteção de dados e LAI; [F1, F2, Q51, Q511, Q52]</w:t>
+              <w:t>IR3: Resposta, declaração de maturidade e Plano de Capacitação em proteção de dados e LAI; [F1, F2, Q51, Q511evi, Q52]</w:t>
             </w:r>
           </w:p>
         </w:tc>
@@ -2005,7 +2117,7 @@
                 <w:sz w:val="18"/>
                 <w:szCs w:val="18"/>
               </w:rPr>
-              <w:t>C8: ABNT NBR ISO/IEC 27701:2019, cláusula 5.3.2 e cláusula 6.2.1.1 — Requer que a política do sistema de gestão da segurança da informação seja estendida por declarações pertinentes à proteção de informações de identificação pessoal e que as políticas de segurança contemplem os requisitos de privacidade aplicáveis.</w:t>
+              <w:t>C8: Guia do Framework de Privacidade e Segurança da Informação — PPSI 2.0, medida 0.12 — Orienta instituir e implementar Política de Proteção de Dados Pessoais que estabeleça diretrizes, papéis e responsabilidades, seja divulgada e passe por revisão periódica ou quando houver mudanças significativas.</w:t>
             </w:r>
           </w:p>
           <w:p ns2:paraId="2667BB09" ns2:textId="2C1623C1">
@@ -2030,7 +2142,107 @@
                 <w:sz w:val="18"/>
                 <w:szCs w:val="18"/>
               </w:rPr>
-              <w:t>C9: ABNT NBR ISO/IEC 27002:2022, controle 5.1, controle 5.12 e controle 6.3 — Orienta a definição e revisão das políticas de segurança da informação, a classificação da informação segundo as necessidades de proteção e a realização periódica de conscientização, educação e treinamento em segurança da informação.</w:t>
+              <w:t>C9: ABNT NBR ISO/IEC 27701:2019, cláusula 5.3.2 e cláusula 6.2.1.1 — Requer que a política do sistema de gestão da segurança da informação seja estendida por declarações pertinentes à proteção de informações de identificação pessoal e que as políticas de segurança contemplem os requisitos de privacidade aplicáveis.</w:t>
+            </w:r>
+          </w:p>
+          <w:p ns2:paraId="2667BB09" ns2:textId="2C1623C1">
+            <w:pPr>
+              <w:pStyle w:val="1010"/>
+              <w:pBdr/>
+              <w:spacing w:after="120"/>
+              <w:ind/>
+              <w:jc w:val="both"/>
+              <w:rPr>
+                <w:bCs/>
+                <w:color w:val="auto"/>
+                <w:sz w:val="18"/>
+                <w:szCs w:val="18"/>
+                <w:vertAlign w:val="superscript"/>
+              </w:rPr>
+            </w:pPr>
+            <w:r>
+              <w:rPr>
+                <w:bCs/>
+                <w:color w:val="auto"/>
+                <w:sz w:val="18"/>
+                <w:szCs w:val="18"/>
+              </w:rPr>
+              <w:t>C10: ABNT NBR ISO/IEC 27002:2022, controle 5.1, controle 5.12 e controle 6.3 — Orienta a definição e revisão das políticas de segurança da informação, a classificação da informação segundo as necessidades de proteção e a realização periódica de conscientização, educação e treinamento em segurança da informação.</w:t>
+            </w:r>
+          </w:p>
+          <w:p ns2:paraId="2667BB09" ns2:textId="2C1623C1">
+            <w:pPr>
+              <w:pStyle w:val="1010"/>
+              <w:pBdr/>
+              <w:spacing w:after="120"/>
+              <w:ind/>
+              <w:jc w:val="both"/>
+              <w:rPr>
+                <w:bCs/>
+                <w:color w:val="auto"/>
+                <w:sz w:val="18"/>
+                <w:szCs w:val="18"/>
+                <w:vertAlign w:val="superscript"/>
+              </w:rPr>
+            </w:pPr>
+            <w:r>
+              <w:rPr>
+                <w:bCs/>
+                <w:color w:val="auto"/>
+                <w:sz w:val="18"/>
+                <w:szCs w:val="18"/>
+              </w:rPr>
+              <w:t>C11: Guia do Framework de Privacidade e Segurança da Informação — PPSI 2.0, medida 0.11 — Orienta instituir e implementar Política de Segurança da Informação formalmente aprovada pela autoridade máxima, com diretrizes, responsabilidades e competências, e revisá-la periodicamente ou diante de mudanças significativas.</w:t>
+            </w:r>
+          </w:p>
+          <w:p ns2:paraId="2667BB09" ns2:textId="2C1623C1">
+            <w:pPr>
+              <w:pStyle w:val="1010"/>
+              <w:pBdr/>
+              <w:spacing w:after="120"/>
+              <w:ind/>
+              <w:jc w:val="both"/>
+              <w:rPr>
+                <w:bCs/>
+                <w:color w:val="auto"/>
+                <w:sz w:val="18"/>
+                <w:szCs w:val="18"/>
+                <w:vertAlign w:val="superscript"/>
+              </w:rPr>
+            </w:pPr>
+            <w:r>
+              <w:rPr>
+                <w:bCs/>
+                <w:color w:val="auto"/>
+                <w:sz w:val="18"/>
+                <w:szCs w:val="18"/>
+              </w:rPr>
+              <w:t>C12: Guia do Framework de Privacidade e Segurança da Informação — PPSI 2.0, medida 3.7 — Orienta estabelecer e manter esquema de classificação de dados baseado na criticidade, com critérios específicos e revisão anual ou diante de mudanças significativas.</w:t>
+            </w:r>
+          </w:p>
+          <w:p ns2:paraId="2667BB09" ns2:textId="2C1623C1">
+            <w:pPr>
+              <w:pStyle w:val="1010"/>
+              <w:pBdr/>
+              <w:spacing w:after="120"/>
+              <w:ind/>
+              <w:jc w:val="both"/>
+              <w:rPr>
+                <w:bCs/>
+                <w:color w:val="auto"/>
+                <w:sz w:val="18"/>
+                <w:szCs w:val="18"/>
+                <w:vertAlign w:val="superscript"/>
+              </w:rPr>
+            </w:pPr>
+            <w:r>
+              <w:rPr>
+                <w:bCs/>
+                <w:color w:val="auto"/>
+                <w:sz w:val="18"/>
+                <w:szCs w:val="18"/>
+              </w:rPr>
+              <w:t>C13: Guia do Framework de Privacidade e Segurança da Informação — PPSI 2.0, medidas 20.2 e 20.3 — Orienta manter programa contínuo de conscientização em privacidade e proteção de dados pessoais e incluir, nos instrumentos de desenvolvimento de pessoas, necessidades de capacitação adequadas às funções exercidas.</w:t>
             </w:r>
           </w:p>
         </w:tc>
@@ -2061,7 +2273,7 @@
                 <w:sz w:val="18"/>
                 <w:szCs w:val="18"/>
               </w:rPr>
-              <w:t>P1: Verificar na resposta à questão Q41[SQ003] se a organização declarou ter formalizado sua Política de Proteção de Dados Pessoais; [IR1]</w:t>
+              <w:t>P1: Verificar nas respostas às questões Q41[SQ003] e Q417 se a organização declarou ter formalizado e publicado sua Política de Proteção de Dados Pessoais; [IR1]</w:t>
             </w:r>
           </w:p>
           <w:p ns2:paraId="4C6E5B2E" ns2:textId="42100C78">
@@ -2085,7 +2297,7 @@
                 <w:sz w:val="18"/>
                 <w:szCs w:val="18"/>
               </w:rPr>
-              <w:t>P1.1: Examinar o documento submetido no item Q411 para avaliar sua autenticidade aparente, aprovação, vigência, publicação, escopo institucional e conteúdo mínimo de proteção de dados pessoais; [IR1]</w:t>
+              <w:t>P1.1: Examinar o documento submetido no item Q411evi para avaliar sua autenticidade aparente, aprovação, vigência, publicação, escopo institucional e conteúdo mínimo de proteção de dados pessoais; [IR1]</w:t>
             </w:r>
           </w:p>
           <w:p ns2:paraId="4C6E5B2E" ns2:textId="42100C78">
@@ -2109,7 +2321,7 @@
                 <w:sz w:val="18"/>
                 <w:szCs w:val="18"/>
               </w:rPr>
-              <w:t>P2: Verificar nas respostas às questões Q41[SQ001] e Q41[SQ002] se a organização declarou ter instituído a Política de Segurança da Informação e a Política de Classificação da Informação; [IR2]</w:t>
+              <w:t>P2: Verificar nas respostas às questões Q41[SQ001], Q416 e Q41[SQ002] se a organização declarou ter instituído e publicado a Política de Segurança da Informação e instituído a Política de Classificação da Informação; [IR2]</w:t>
             </w:r>
           </w:p>
           <w:p ns2:paraId="4C6E5B2E" ns2:textId="42100C78">
@@ -2133,7 +2345,7 @@
                 <w:sz w:val="18"/>
                 <w:szCs w:val="18"/>
               </w:rPr>
-              <w:t>P2.1: Examinar os documentos submetidos nos itens Q412 e Q413 para avaliar aprovação, vigência, publicação, responsabilidades, controles de segurança e regras de classificação aplicáveis a dados pessoais sensíveis e a dados de crianças e adolescentes; [IR2]</w:t>
+              <w:t>P2.1: Examinar os documentos submetidos nos itens Q412evi e Q413evi para avaliar aprovação, vigência, publicação, responsabilidades, controles de segurança e regras de classificação aplicáveis a dados pessoais sensíveis e a dados de crianças e adolescentes; [IR2]</w:t>
             </w:r>
           </w:p>
           <w:p ns2:paraId="4C6E5B2E" ns2:textId="42100C78">
@@ -2181,7 +2393,7 @@
                 <w:sz w:val="18"/>
                 <w:szCs w:val="18"/>
               </w:rPr>
-              <w:t>P3.1: Examinar o documento submetido no item Q511 para avaliar aprovação, vigência, público-alvo, conteúdo programático e periodicidade prevista das ações de capacitação; [IR3]</w:t>
+              <w:t>P3.1: Examinar o documento submetido no item Q511evi para avaliar aprovação, vigência, público-alvo, conteúdo programático e periodicidade prevista das ações de capacitação; [IR3]</w:t>
             </w:r>
           </w:p>
         </w:tc>
@@ -2209,7 +2421,7 @@
                 <w:sz w:val="18"/>
                 <w:szCs w:val="18"/>
               </w:rPr>
-              <w:t>E1: Registro da resposta à questão Q41[SQ003] sobre a formalização da Política de Proteção de Dados Pessoais; [P1]</w:t>
+              <w:t>E1: Registro das respostas às questões Q41[SQ003] e Q417 sobre a formalização e a publicação da Política de Proteção de Dados Pessoais; [P1]</w:t>
             </w:r>
           </w:p>
           <w:p ns2:paraId="1E80855F" ns2:textId="1D853748">
@@ -2230,7 +2442,7 @@
                 <w:sz w:val="18"/>
                 <w:szCs w:val="18"/>
               </w:rPr>
-              <w:t>E1.1: Resultado da análise da política Q411, com registro de aprovação, vigência, publicação, conteúdo mínimo e eventuais inconsistências com a declaração; [P1.1]</w:t>
+              <w:t>E1.1: Resultado da análise da política Q411evi, com registro de aprovação, vigência, publicação, conteúdo mínimo e eventuais inconsistências com a declaração; [P1.1]</w:t>
             </w:r>
           </w:p>
           <w:p ns2:paraId="1E80855F" ns2:textId="1D853748">
@@ -2251,7 +2463,7 @@
                 <w:sz w:val="18"/>
                 <w:szCs w:val="18"/>
               </w:rPr>
-              <w:t>E2: Registro das respostas às questões Q41[SQ001] e Q41[SQ002] sobre a instituição da PSI e da Política de Classificação da Informação; [P2]</w:t>
+              <w:t>E2: Registro das respostas às questões Q41[SQ001], Q416 e Q41[SQ002] sobre a instituição e a publicação da PSI e a instituição da Política de Classificação da Informação; [P2]</w:t>
             </w:r>
           </w:p>
           <w:p ns2:paraId="1E80855F" ns2:textId="1D853748">
@@ -2272,7 +2484,7 @@
                 <w:sz w:val="18"/>
                 <w:szCs w:val="18"/>
               </w:rPr>
-              <w:t>E2.1: Resultado da análise das políticas Q412 e Q413, com registro de formalização, conteúdo mínimo e eventuais inconsistências com as declarações; [P2.1]</w:t>
+              <w:t>E2.1: Resultado da análise das políticas Q412evi e Q413evi, com registro de formalização, conteúdo mínimo e eventuais inconsistências com as declarações; [P2.1]</w:t>
             </w:r>
           </w:p>
           <w:p ns2:paraId="1E80855F" ns2:textId="1D853748">
@@ -2314,7 +2526,7 @@
                 <w:sz w:val="18"/>
                 <w:szCs w:val="18"/>
               </w:rPr>
-              <w:t>E3.1: Resultado da análise do plano Q511, com indicação de aprovação, vigência, abrangência temática, público-alvo, periodicidade e eventuais inconsistências com a declaração; [P3.1]</w:t>
+              <w:t>E3.1: Resultado da análise do plano Q511evi, com indicação de aprovação, vigência, abrangência temática, público-alvo, periodicidade e eventuais inconsistências com a declaração; [P3.1]</w:t>
             </w:r>
           </w:p>
         </w:tc>
@@ -2367,7 +2579,7 @@
                 <w:sz w:val="18"/>
                 <w:szCs w:val="18"/>
               </w:rPr>
-              <w:t>• Ausência de formalização e publicação de Política de Proteção de Dados Pessoais no âmbito da administração municipal. [R2.1, P1, P1.1, E1, E1.1, C1, C4, C8];</w:t>
+              <w:t>• Ausência de formalização e publicação de Política de Proteção de Dados Pessoais no âmbito da administração municipal. [R2.1, P1, P1.1, E1, E1.1, C1, C4, C8, C9];</w:t>
             </w:r>
           </w:p>
           <w:p ns2:paraId="11118515" ns2:textId="02403B9E">
@@ -2390,7 +2602,7 @@
                 <w:sz w:val="18"/>
                 <w:szCs w:val="18"/>
               </w:rPr>
-              <w:t>• Inexistência de Política de Segurança da Informação (PSI) ou de Política de Classificação da Informação formalmente instituídas. [R2.1, R2.2, P2, P2.1, E2, E2.1, C2, C5, C6, C9];</w:t>
+              <w:t>• Inexistência de Política de Segurança da Informação (PSI) ou de Política de Classificação da Informação formalmente instituídas. [R2.1, R2.2, P2, P2.1, E2, E2.1, C2, C5, C6, C10, C11, C12];</w:t>
             </w:r>
           </w:p>
           <w:p ns2:paraId="11118515" ns2:textId="02403B9E">
@@ -2413,7 +2625,7 @@
                 <w:sz w:val="18"/>
                 <w:szCs w:val="18"/>
               </w:rPr>
-              <w:t>• Ausência de plano de capacitação e de ações periódicas de conscientização de servidores em proteção de dados pessoais e transparência pública. [R2.3, P3, P3.1, E3, E3.1, C3, C7, C9];</w:t>
+              <w:t>• Ausência de plano de capacitação e de ações periódicas de conscientização de servidores em proteção de dados pessoais e transparência pública. [R2.3, P3, P3.1, E3, E3.1, C3, C7, C10, C13];</w:t>
             </w:r>
           </w:p>
         </w:tc>
@@ -2461,6 +2673,13 @@
               </w:rPr>
             </w:pPr>
             <w:r>
+              <w:rPr>
+                <w:b/>
+                <w:bCs/>
+                <w:rFonts w:ascii="Arial" w:hAnsi="Arial" w:cs="Arial" w:eastAsia="Arial"/>
+                <w:sz w:val="20"/>
+                <w:szCs w:val="20"/>
+              </w:rPr>
               <w:t>Q3: A organização identificou seus processos de negócio com dados pessoais, documentou finalidades e bases legais e instituiu Inventário de Dados Pessoais e Registro das Operações de Tratamento (ROPA)?</w:t>
             </w:r>
           </w:p>
@@ -2482,7 +2701,7 @@
             </w:pPr>
             <w:r>
               <w:rPr>
-                <w:rFonts w:ascii="Arial" w:hAnsi="Arial" w:cs="Arial"/>
+                <w:rFonts w:ascii="Arial" w:hAnsi="Arial" w:cs="Arial" w:eastAsia="Arial"/>
                 <w:sz w:val="20"/>
                 <w:szCs w:val="20"/>
               </w:rPr>
@@ -2507,7 +2726,7 @@
             </w:pPr>
             <w:r>
               <w:rPr>
-                <w:rFonts w:ascii="Arial" w:hAnsi="Arial" w:cs="Arial"/>
+                <w:rFonts w:ascii="Arial" w:hAnsi="Arial" w:cs="Arial" w:eastAsia="Arial"/>
                 <w:sz w:val="20"/>
                 <w:szCs w:val="20"/>
               </w:rPr>
@@ -2532,7 +2751,7 @@
             </w:pPr>
             <w:r>
               <w:rPr>
-                <w:rFonts w:ascii="Arial" w:hAnsi="Arial" w:cs="Arial"/>
+                <w:rFonts w:ascii="Arial" w:hAnsi="Arial" w:cs="Arial" w:eastAsia="Arial"/>
                 <w:sz w:val="20"/>
                 <w:szCs w:val="20"/>
               </w:rPr>
@@ -2557,7 +2776,7 @@
             </w:pPr>
             <w:r>
               <w:rPr>
-                <w:rFonts w:ascii="Arial" w:hAnsi="Arial" w:cs="Arial"/>
+                <w:rFonts w:ascii="Arial" w:hAnsi="Arial" w:cs="Arial" w:eastAsia="Arial"/>
                 <w:sz w:val="20"/>
                 <w:szCs w:val="20"/>
               </w:rPr>
@@ -2582,7 +2801,7 @@
             </w:pPr>
             <w:r>
               <w:rPr>
-                <w:rFonts w:ascii="Arial" w:hAnsi="Arial" w:cs="Arial"/>
+                <w:rFonts w:ascii="Arial" w:hAnsi="Arial" w:cs="Arial" w:eastAsia="Arial"/>
                 <w:sz w:val="20"/>
                 <w:szCs w:val="20"/>
               </w:rPr>
@@ -3033,7 +3252,7 @@
                 <w:sz w:val="18"/>
                 <w:szCs w:val="18"/>
               </w:rPr>
-              <w:t>IR3: Resposta e documento comprobatório do Inventário de Dados Pessoais; [F1, F2, Q61[SQ005], Q61[SQ006], Q612]</w:t>
+              <w:t>IR3: Resposta e documento comprobatório do Inventário de Dados Pessoais; [F1, F2, Q61[SQ005], Q61[SQ006], Q612evi]</w:t>
             </w:r>
           </w:p>
           <w:p ns2:paraId="1DD0E491" ns2:textId="77777777">
@@ -3166,6 +3385,56 @@
               <w:t>C4: Acórdão nº 3931/2025 do Plenário do TCE-RJ (Processo TCE-RJ nº 217.899-0/2024), Voto do Relator, item 1.4 — Determinação aos jurisdicionados para elaborar e manter Inventário de Dados Pessoais constando minimamente: serviços/processos de negócio; encarregado e agentes; finalidades, hipóteses de tratamento e previsões legais; categorias de dados e titulares; e compartilhamento com terceiros.</w:t>
             </w:r>
           </w:p>
+          <w:p ns2:paraId="2667BB09" ns2:textId="2C1623C1">
+            <w:pPr>
+              <w:pStyle w:val="1010"/>
+              <w:pBdr/>
+              <w:spacing w:after="120"/>
+              <w:ind/>
+              <w:jc w:val="both"/>
+              <w:rPr>
+                <w:bCs/>
+                <w:color w:val="auto"/>
+                <w:sz w:val="18"/>
+                <w:szCs w:val="18"/>
+                <w:vertAlign w:val="superscript"/>
+              </w:rPr>
+            </w:pPr>
+            <w:r>
+              <w:rPr>
+                <w:bCs/>
+                <w:color w:val="auto"/>
+                <w:sz w:val="18"/>
+                <w:szCs w:val="18"/>
+              </w:rPr>
+              <w:t>C5: Guia do Framework de Privacidade e Segurança da Informação — PPSI 2.0, medidas 19.1 a 19.4 — Orienta manter processo documentado e periodicamente atualizado para registrar as operações de tratamento, contemplando fluxos, fontes, finalidades, hipóteses legais, retenção, soluções tecnológicas, agentes, compartilhamentos, transferências internacionais, tipos de dados e categorias de titulares.</w:t>
+            </w:r>
+          </w:p>
+          <w:p ns2:paraId="2667BB09" ns2:textId="2C1623C1">
+            <w:pPr>
+              <w:pStyle w:val="1010"/>
+              <w:pBdr/>
+              <w:spacing w:after="120"/>
+              <w:ind/>
+              <w:jc w:val="both"/>
+              <w:rPr>
+                <w:bCs/>
+                <w:color w:val="auto"/>
+                <w:sz w:val="18"/>
+                <w:szCs w:val="18"/>
+                <w:vertAlign w:val="superscript"/>
+              </w:rPr>
+            </w:pPr>
+            <w:r>
+              <w:rPr>
+                <w:bCs/>
+                <w:color w:val="auto"/>
+                <w:sz w:val="18"/>
+                <w:szCs w:val="18"/>
+              </w:rPr>
+              <w:t>C6: Guia do Framework de Privacidade e Segurança da Informação — PPSI 2.0, medidas 23.1, 23.2, 25.1 e 25.3 — Orienta analisar e documentar a finalidade pública e as hipóteses legais de cada tratamento e limitar os dados pessoais ao estritamente necessário para as finalidades legítimas, específicas e explícitas.</w:t>
+            </w:r>
+          </w:p>
         </w:tc>
         <w:tc>
           <w:tcPr>
@@ -3218,7 +3487,7 @@
                 <w:sz w:val="18"/>
                 <w:szCs w:val="18"/>
               </w:rPr>
-              <w:t>P1.1: Examinar o Inventário de Dados Pessoais submetido no item Q612 para avaliar se identifica processos, dados tratados, responsáveis e locais de armazenamento de forma compatível com as declarações; [IR1]</w:t>
+              <w:t>P1.1: Examinar o Inventário de Dados Pessoais submetido no item Q612evi para avaliar se identifica processos, dados tratados, responsáveis e locais de armazenamento de forma compatível com as declarações; [IR1]</w:t>
             </w:r>
           </w:p>
           <w:p ns2:paraId="4C6E5B2E" ns2:textId="42100C78">
@@ -3290,7 +3559,7 @@
                 <w:sz w:val="18"/>
                 <w:szCs w:val="18"/>
               </w:rPr>
-              <w:t>P3.1: Examinar o documento submetido no item Q612 para avaliar aprovação, vigência, atualização e abrangência quanto a processos, finalidades, bases legais, categorias de dados e titulares, responsáveis, armazenamento e compartilhamentos; [IR3]</w:t>
+              <w:t>P3.1: Examinar o documento submetido no item Q612evi para avaliar aprovação, vigência, atualização e abrangência quanto a processos, finalidades, bases legais, categorias de dados e titulares, responsáveis, armazenamento e compartilhamentos; [IR3]</w:t>
             </w:r>
           </w:p>
           <w:p ns2:paraId="4C6E5B2E" ns2:textId="42100C78">
@@ -3363,7 +3632,7 @@
                 <w:sz w:val="18"/>
                 <w:szCs w:val="18"/>
               </w:rPr>
-              <w:t>E1.1: Resultado do exame do Inventário Q612 quanto à identificação dos processos, dados, responsáveis e locais de armazenamento e à consistência com as declarações; [P1.1]</w:t>
+              <w:t>E1.1: Resultado do exame do Inventário Q612evi quanto à identificação dos processos, dados, responsáveis e locais de armazenamento e à consistência com as declarações; [P1.1]</w:t>
             </w:r>
           </w:p>
           <w:p ns2:paraId="1E80855F" ns2:textId="1D853748">
@@ -3426,7 +3695,7 @@
                 <w:sz w:val="18"/>
                 <w:szCs w:val="18"/>
               </w:rPr>
-              <w:t>E3.1: Resultado da análise do documento Q612, com registro de aprovação, vigência, atualização, abrangência e eventuais inconsistências com as declarações; [P3.1]</w:t>
+              <w:t>E3.1: Resultado da análise do documento Q612evi, com registro de aprovação, vigência, atualização, abrangência e eventuais inconsistências com as declarações; [P3.1]</w:t>
             </w:r>
           </w:p>
           <w:p ns2:paraId="1E80855F" ns2:textId="1D853748">
@@ -3500,7 +3769,7 @@
                 <w:sz w:val="18"/>
                 <w:szCs w:val="18"/>
               </w:rPr>
-              <w:t>• Inexistência de Inventário de Dados Pessoais instituído para consolidar as características das atividades de tratamento. [R3.1, R3.3, P1, P1.1, P3, P3.1, E1, E1.1, E3, E3.1, C3, C4];</w:t>
+              <w:t>• Inexistência de Inventário de Dados Pessoais instituído para consolidar as características das atividades de tratamento. [R3.1, R3.3, P1, P1.1, P3, P3.1, E1, E1.1, E3, E3.1, C3, C4, C5];</w:t>
             </w:r>
           </w:p>
           <w:p ns2:paraId="11118515" ns2:textId="02403B9E">
@@ -3523,7 +3792,7 @@
                 <w:sz w:val="18"/>
                 <w:szCs w:val="18"/>
               </w:rPr>
-              <w:t>• Ausência de identificação e documentação das finalidades e das bases legais para as atividades de tratamento de dados pessoais. [R3.2, P2, E2, C2, C4];</w:t>
+              <w:t>• Ausência de identificação e documentação das finalidades e das bases legais para as atividades de tratamento de dados pessoais. [R3.2, P2, E2, C2, C4, C6];</w:t>
             </w:r>
           </w:p>
           <w:p ns2:paraId="11118515" ns2:textId="02403B9E">
@@ -3546,7 +3815,7 @@
                 <w:sz w:val="18"/>
                 <w:szCs w:val="18"/>
               </w:rPr>
-              <w:t>• Ausência de manutenção de Registro das Operações de Tratamento de Dados Pessoais (ROPA), em descumprimento ao art. 37 da LGPD. [R3.3, P4, E4, C1, C4];</w:t>
+              <w:t>• Ausência de manutenção de Registro das Operações de Tratamento de Dados Pessoais (ROPA), em descumprimento ao art. 37 da LGPD. [R3.3, P4, E4, C1, C4, C5];</w:t>
             </w:r>
           </w:p>
         </w:tc>
@@ -3594,6 +3863,13 @@
               </w:rPr>
             </w:pPr>
             <w:r>
+              <w:rPr>
+                <w:b/>
+                <w:bCs/>
+                <w:rFonts w:ascii="Arial" w:hAnsi="Arial" w:cs="Arial" w:eastAsia="Arial"/>
+                <w:sz w:val="20"/>
+                <w:szCs w:val="20"/>
+              </w:rPr>
               <w:t>Q4: A organização avaliou os riscos aos processos de tratamento e elaborou Relatório de Impacto à Proteção de Dados Pessoais (RIPD)?</w:t>
             </w:r>
           </w:p>
@@ -3615,7 +3891,7 @@
             </w:pPr>
             <w:r>
               <w:rPr>
-                <w:rFonts w:ascii="Arial" w:hAnsi="Arial" w:cs="Arial"/>
+                <w:rFonts w:ascii="Arial" w:hAnsi="Arial" w:cs="Arial" w:eastAsia="Arial"/>
                 <w:sz w:val="20"/>
                 <w:szCs w:val="20"/>
               </w:rPr>
@@ -3640,7 +3916,7 @@
             </w:pPr>
             <w:r>
               <w:rPr>
-                <w:rFonts w:ascii="Arial" w:hAnsi="Arial" w:cs="Arial"/>
+                <w:rFonts w:ascii="Arial" w:hAnsi="Arial" w:cs="Arial" w:eastAsia="Arial"/>
                 <w:sz w:val="20"/>
                 <w:szCs w:val="20"/>
               </w:rPr>
@@ -3665,7 +3941,7 @@
             </w:pPr>
             <w:r>
               <w:rPr>
-                <w:rFonts w:ascii="Arial" w:hAnsi="Arial" w:cs="Arial"/>
+                <w:rFonts w:ascii="Arial" w:hAnsi="Arial" w:cs="Arial" w:eastAsia="Arial"/>
                 <w:sz w:val="20"/>
                 <w:szCs w:val="20"/>
               </w:rPr>
@@ -4047,7 +4323,7 @@
                 <w:sz w:val="18"/>
                 <w:szCs w:val="18"/>
               </w:rPr>
-              <w:t>IR1: Resposta e registros sobre a condução de iniciativas de identificação e avaliação de riscos a processos de tratamento; [F1, F2, Q31[SQ009], Q31riscoevi]</w:t>
+              <w:t>IR1: Resposta e registros sobre a condução de iniciativas de identificação e avaliação de riscos a processos de tratamento; [F1, F2, Q31[SQ009], Q311evi]</w:t>
             </w:r>
           </w:p>
           <w:p ns2:paraId="1DD0E491" ns2:textId="77777777">
@@ -4070,7 +4346,7 @@
                 <w:sz w:val="18"/>
                 <w:szCs w:val="18"/>
               </w:rPr>
-              <w:t>IR2: Resposta e documento comprobatório de Relatório de Impacto à Proteção de Dados Pessoais (RIPD); [F1, F2, Q61[SQ008], Q611]</w:t>
+              <w:t>IR2: Resposta e documento comprobatório de Relatório de Impacto à Proteção de Dados Pessoais (RIPD); [F1, F2, Q61[SQ008], Q611evi]</w:t>
             </w:r>
           </w:p>
           <w:p ns2:paraId="1DD0E491" ns2:textId="77777777">
@@ -4093,7 +4369,7 @@
                 <w:sz w:val="18"/>
                 <w:szCs w:val="18"/>
               </w:rPr>
-              <w:t>IR3: Resposta e registros sobre a implementação de controles para mitigar riscos identificados no RIPD; [F1, F2, Q61[SQ009], Q61controleevi]</w:t>
+              <w:t>IR3: Resposta e registros sobre a implementação de controles para mitigar riscos identificados no RIPD; [F1, F2, Q61[SQ009], Q613evi]</w:t>
             </w:r>
           </w:p>
         </w:tc>
@@ -4203,6 +4479,56 @@
               <w:t>C4: ABNT NBR ISO/IEC 27701:2019, cláusula 5.4.1.2, cláusula 5.4.1.3 e cláusula 7.2.5 — Requer avaliação e tratamento dos riscos de segurança da informação relacionados à privacidade e avaliação de impacto à privacidade para novos tratamentos ou alterações em tratamentos existentes de informações de identificação pessoal.</w:t>
             </w:r>
           </w:p>
+          <w:p ns2:paraId="2667BB09" ns2:textId="2C1623C1">
+            <w:pPr>
+              <w:pStyle w:val="1010"/>
+              <w:pBdr/>
+              <w:spacing w:after="120"/>
+              <w:ind/>
+              <w:jc w:val="both"/>
+              <w:rPr>
+                <w:bCs/>
+                <w:color w:val="auto"/>
+                <w:sz w:val="18"/>
+                <w:szCs w:val="18"/>
+                <w:vertAlign w:val="superscript"/>
+              </w:rPr>
+            </w:pPr>
+            <w:r>
+              <w:rPr>
+                <w:bCs/>
+                <w:color w:val="auto"/>
+                <w:sz w:val="18"/>
+                <w:szCs w:val="18"/>
+              </w:rPr>
+              <w:t>C5: Guia do Framework de Privacidade e Segurança da Informação — PPSI 2.0, medida 0.17 — Orienta estabelecer, manter, revisar e atualizar processo documentado de gestão de riscos relacionados às operações de tratamento de dados pessoais, incluindo medidas técnicas e administrativas testadas e avaliadas.</w:t>
+            </w:r>
+          </w:p>
+          <w:p ns2:paraId="2667BB09" ns2:textId="2C1623C1">
+            <w:pPr>
+              <w:pStyle w:val="1010"/>
+              <w:pBdr/>
+              <w:spacing w:after="120"/>
+              <w:ind/>
+              <w:jc w:val="both"/>
+              <w:rPr>
+                <w:bCs/>
+                <w:color w:val="auto"/>
+                <w:sz w:val="18"/>
+                <w:szCs w:val="18"/>
+                <w:vertAlign w:val="superscript"/>
+              </w:rPr>
+            </w:pPr>
+            <w:r>
+              <w:rPr>
+                <w:bCs/>
+                <w:color w:val="auto"/>
+                <w:sz w:val="18"/>
+                <w:szCs w:val="18"/>
+              </w:rPr>
+              <w:t>C6: Guia do Framework de Privacidade e Segurança da Informação — PPSI 2.0, medidas 23.3 e 25.8 — Orienta avaliar os tratamentos que possam gerar riscos às liberdades civis e aos direitos fundamentais, elaborar o RIPD com os elementos mínimos aplicáveis e implementar salvaguardas e mecanismos de mitigação dos riscos identificados.</w:t>
+            </w:r>
+          </w:p>
         </w:tc>
         <w:tc>
           <w:tcPr>
@@ -4255,7 +4581,7 @@
                 <w:sz w:val="18"/>
                 <w:szCs w:val="18"/>
               </w:rPr>
-              <w:t>P1.1: Examinar as matrizes, os relatórios ou os registros de riscos submetidos no item Q31riscoevi para avaliar escopo, metodologia, identificação, análise, avaliação, responsáveis e consistência com a declaração; [IR1]</w:t>
+              <w:t>P1.1: Examinar as matrizes, os relatórios ou os registros de riscos submetidos no item Q311evi para avaliar escopo, metodologia, identificação, análise, avaliação, responsáveis e consistência com a declaração; [IR1]</w:t>
             </w:r>
           </w:p>
           <w:p ns2:paraId="4C6E5B2E" ns2:textId="42100C78">
@@ -4303,7 +4629,7 @@
                 <w:sz w:val="18"/>
                 <w:szCs w:val="18"/>
               </w:rPr>
-              <w:t>P2.1: Examinar o documento submetido no item Q611 para avaliar autenticidade aparente, aprovação, vigência, vinculação às operações inventariadas e presença dos elementos mínimos do RIPD; [IR2]</w:t>
+              <w:t>P2.1: Examinar o documento submetido no item Q611evi para avaliar autenticidade aparente, aprovação, vigência, vinculação às operações inventariadas e presença dos elementos mínimos do RIPD; [IR2]</w:t>
             </w:r>
           </w:p>
           <w:p ns2:paraId="4C6E5B2E" ns2:textId="42100C78">
@@ -4351,7 +4677,7 @@
                 <w:sz w:val="18"/>
                 <w:szCs w:val="18"/>
               </w:rPr>
-              <w:t>P3.1: Examinar os planos de tratamento e os registros de implantação e monitoramento submetidos no item Q61controleevi para avaliar a implementação, o responsável, o prazo, o estado e a efetividade documentada dos controles mitigadores; [IR3]</w:t>
+              <w:t>P3.1: Examinar os planos de tratamento e os registros de implantação e monitoramento submetidos no item Q613evi para avaliar a implementação, o responsável, o prazo, o estado e a efetividade documentada dos controles mitigadores; [IR3]</w:t>
             </w:r>
           </w:p>
         </w:tc>
@@ -4400,7 +4726,7 @@
                 <w:sz w:val="18"/>
                 <w:szCs w:val="18"/>
               </w:rPr>
-              <w:t>E1.1: Resultado do exame do documento Q31riscoevi, com indicação de escopo, metodologia, completude e eventuais inconsistências com a declaração; [P1.1]</w:t>
+              <w:t>E1.1: Resultado do exame do documento Q311evi, com indicação de escopo, metodologia, completude e eventuais inconsistências com a declaração; [P1.1]</w:t>
             </w:r>
           </w:p>
           <w:p ns2:paraId="1E80855F" ns2:textId="1D853748">
@@ -4442,7 +4768,7 @@
                 <w:sz w:val="18"/>
                 <w:szCs w:val="18"/>
               </w:rPr>
-              <w:t>E2.1: Resultado da análise do documento Q611, com registro de aprovação, vigência, operações abrangidas, conteúdo mínimo e eventuais inconsistências com a declaração; [P2.1]</w:t>
+              <w:t>E2.1: Resultado da análise do documento Q611evi, com registro de aprovação, vigência, operações abrangidas, conteúdo mínimo e eventuais inconsistências com a declaração; [P2.1]</w:t>
             </w:r>
           </w:p>
           <w:p ns2:paraId="1E80855F" ns2:textId="1D853748">
@@ -4484,7 +4810,7 @@
                 <w:sz w:val="18"/>
                 <w:szCs w:val="18"/>
               </w:rPr>
-              <w:t>E3.1: Resultado da análise do documento Q61controleevi, incluindo responsáveis, prazos, estado e efetividade documentada dos controles; [P3.1]</w:t>
+              <w:t>E3.1: Resultado da análise do documento Q613evi, incluindo responsáveis, prazos, estado e efetividade documentada dos controles; [P3.1]</w:t>
             </w:r>
           </w:p>
         </w:tc>
@@ -4537,7 +4863,7 @@
                 <w:sz w:val="18"/>
                 <w:szCs w:val="18"/>
               </w:rPr>
-              <w:t>• Ausência de iniciativas formais para identificação e avaliação dos riscos associados aos processos de tratamento de dados pessoais. [R4.1, P1, P1.1, E1, E1.1, C2, C4];</w:t>
+              <w:t>• Ausência de iniciativas formais para identificação e avaliação dos riscos associados aos processos de tratamento de dados pessoais. [R4.1, P1, P1.1, E1, E1.1, C2, C4, C5];</w:t>
             </w:r>
           </w:p>
           <w:p ns2:paraId="11118515" ns2:textId="02403B9E">
@@ -4560,7 +4886,7 @@
                 <w:sz w:val="18"/>
                 <w:szCs w:val="18"/>
               </w:rPr>
-              <w:t>• Ausência de elaboração de Relatório de Impacto à Proteção de Dados Pessoais (RIPD) para as atividades de tratamento cabíveis. [R4.2, R4.3, P2, P2.1, P3, P3.1, E2, E2.1, E3, E3.1, C1, C3, C4];</w:t>
+              <w:t>• Ausência de elaboração de Relatório de Impacto à Proteção de Dados Pessoais (RIPD) para as atividades de tratamento cabíveis. [R4.2, R4.3, P2, P2.1, P3, P3.1, E2, E2.1, E3, E3.1, C1, C3, C4, C6];</w:t>
             </w:r>
           </w:p>
         </w:tc>
@@ -4608,6 +4934,13 @@
               </w:rPr>
             </w:pPr>
             <w:r>
+              <w:rPr>
+                <w:b/>
+                <w:bCs/>
+                <w:rFonts w:ascii="Arial" w:hAnsi="Arial" w:cs="Arial" w:eastAsia="Arial"/>
+                <w:sz w:val="20"/>
+                <w:szCs w:val="20"/>
+              </w:rPr>
               <w:t>Q5: A organização elaborou e divulga Política de Privacidade em seu sítio oficial e implementou mecanismos eficazes para atender aos direitos dos titulares de dados pessoais?</w:t>
             </w:r>
           </w:p>
@@ -4629,7 +4962,7 @@
             </w:pPr>
             <w:r>
               <w:rPr>
-                <w:rFonts w:ascii="Arial" w:hAnsi="Arial" w:cs="Arial"/>
+                <w:rFonts w:ascii="Arial" w:hAnsi="Arial" w:cs="Arial" w:eastAsia="Arial"/>
                 <w:sz w:val="20"/>
                 <w:szCs w:val="20"/>
               </w:rPr>
@@ -4654,7 +4987,7 @@
             </w:pPr>
             <w:r>
               <w:rPr>
-                <w:rFonts w:ascii="Arial" w:hAnsi="Arial" w:cs="Arial"/>
+                <w:rFonts w:ascii="Arial" w:hAnsi="Arial" w:cs="Arial" w:eastAsia="Arial"/>
                 <w:sz w:val="20"/>
                 <w:szCs w:val="20"/>
               </w:rPr>
@@ -5034,7 +5367,7 @@
                 <w:sz w:val="18"/>
                 <w:szCs w:val="18"/>
               </w:rPr>
-              <w:t>IR1: Resposta, declaração de divulgação e documento anexado da Política de Privacidade; [F1, F2, F3, Q71, Q71[comment], Q711]</w:t>
+              <w:t>IR1: Resposta, declaração de divulgação e documento anexado da Política de Privacidade; [F1, F2, F3, Q71, Q711evi]</w:t>
             </w:r>
           </w:p>
           <w:p ns2:paraId="1DD0E491" ns2:textId="77777777">
@@ -5057,7 +5390,7 @@
                 <w:sz w:val="18"/>
                 <w:szCs w:val="18"/>
               </w:rPr>
-              <w:t>IR2: Resposta, procedimentos e detalhamento dos mecanismos implementados para atender aos direitos dos titulares; [F1, F2, F3, Q72, Q72[comment], Q72evi]</w:t>
+              <w:t>IR2: Resposta, procedimentos e detalhamento dos mecanismos implementados para atender aos direitos dos titulares; [F1, F2, F3, Q72, Q721evi]</w:t>
             </w:r>
           </w:p>
         </w:tc>
@@ -5167,6 +5500,56 @@
               <w:t>C4: Acórdão nº 3931/2025 do Plenário do TCE-RJ (Processo TCE-RJ nº 217.899-0/2024), Voto do Relator, item 1.8 — Determinação aos jurisdicionados para implementar mecanismos para atender a todos os direitos dos titulares relacionados no art. 18 da LGPD.</w:t>
             </w:r>
           </w:p>
+          <w:p ns2:paraId="2667BB09" ns2:textId="2C1623C1">
+            <w:pPr>
+              <w:pStyle w:val="1010"/>
+              <w:pBdr/>
+              <w:spacing w:after="120"/>
+              <w:ind/>
+              <w:jc w:val="both"/>
+              <w:rPr>
+                <w:bCs/>
+                <w:color w:val="auto"/>
+                <w:sz w:val="18"/>
+                <w:szCs w:val="18"/>
+                <w:vertAlign w:val="superscript"/>
+              </w:rPr>
+            </w:pPr>
+            <w:r>
+              <w:rPr>
+                <w:bCs/>
+                <w:color w:val="auto"/>
+                <w:sz w:val="18"/>
+                <w:szCs w:val="18"/>
+              </w:rPr>
+              <w:t>C5: Guia do Framework de Privacidade e Segurança da Informação — PPSI 2.0, medida 25.6 — Orienta assegurar aos titulares informações claras, precisas e facilmente acessíveis sobre os tratamentos, mediante instrumentos de transparência em privacidade adequados ao público-alvo e com o conteúdo mínimo aplicável.</w:t>
+            </w:r>
+          </w:p>
+          <w:p ns2:paraId="2667BB09" ns2:textId="2C1623C1">
+            <w:pPr>
+              <w:pStyle w:val="1010"/>
+              <w:pBdr/>
+              <w:spacing w:after="120"/>
+              <w:ind/>
+              <w:jc w:val="both"/>
+              <w:rPr>
+                <w:bCs/>
+                <w:color w:val="auto"/>
+                <w:sz w:val="18"/>
+                <w:szCs w:val="18"/>
+                <w:vertAlign w:val="superscript"/>
+              </w:rPr>
+            </w:pPr>
+            <w:r>
+              <w:rPr>
+                <w:bCs/>
+                <w:color w:val="auto"/>
+                <w:sz w:val="18"/>
+                <w:szCs w:val="18"/>
+              </w:rPr>
+              <w:t>C6: Guia do Framework de Privacidade e Segurança da Informação — PPSI 2.0, medidas 21.2 e 21.3 — Orienta disponibilizar meios céleres, eficazes e adequados de comunicação com o Encarregado e estabelecer processo documentado, com papéis, responsabilidades, prazos e requisitos, para atendimento aos direitos dos titulares.</w:t>
+            </w:r>
+          </w:p>
         </w:tc>
         <w:tc>
           <w:tcPr>
@@ -5195,7 +5578,7 @@
                 <w:sz w:val="18"/>
                 <w:szCs w:val="18"/>
               </w:rPr>
-              <w:t>P1: Verificar na resposta e nos comentários da questão Q71 se a organização declarou ter elaborado e divulgado sua Política de Privacidade no sítio eletrônico institucional; [IR1]</w:t>
+              <w:t>P1: Verificar na resposta da questão Q71 se a organização declarou ter elaborado e divulgado sua Política de Privacidade no sítio eletrônico institucional; [IR1]</w:t>
             </w:r>
           </w:p>
           <w:p ns2:paraId="4C6E5B2E" ns2:textId="42100C78">
@@ -5219,7 +5602,7 @@
                 <w:sz w:val="18"/>
                 <w:szCs w:val="18"/>
               </w:rPr>
-              <w:t>P1.1: Examinar o documento submetido no item Q711 para avaliar aprovação, vigência, clareza, acessibilidade e conteúdo mínimo sobre finalidades, duração do tratamento, controlador, compartilhamentos e direitos dos titulares; [IR1]</w:t>
+              <w:t>P1.1: Examinar o documento submetido no item Q711evi para avaliar aprovação, vigência, clareza, acessibilidade e conteúdo mínimo sobre finalidades, duração do tratamento, controlador, compartilhamentos e direitos dos titulares; [IR1]</w:t>
             </w:r>
           </w:p>
           <w:p ns2:paraId="4C6E5B2E" ns2:textId="42100C78">
@@ -5267,7 +5650,7 @@
                 <w:sz w:val="18"/>
                 <w:szCs w:val="18"/>
               </w:rPr>
-              <w:t>P2: Verificar na resposta e nos comentários da questão Q72 se a organização declarou ter implementado mecanismos para atendimento aos direitos dos titulares previstos nos arts. 9º e 18 da LGPD; [IR2]</w:t>
+              <w:t>P2: Verificar na resposta da questão Q72 se a organização declarou ter implementado mecanismos para atendimento aos direitos dos titulares previstos nos arts. 9º e 18 da LGPD; [IR2]</w:t>
             </w:r>
           </w:p>
           <w:p ns2:paraId="4C6E5B2E" ns2:textId="42100C78">
@@ -5291,7 +5674,7 @@
                 <w:sz w:val="18"/>
                 <w:szCs w:val="18"/>
               </w:rPr>
-              <w:t>P2.1: Examinar o procedimento ou fluxo submetido no item Q72evi e inspecionar os canais divulgados no portal institucional para avaliar quais direitos podem ser exercidos, as formas de autenticação, o encaminhamento das solicitações, a gratuidade e o acompanhamento dos pedidos; [IR2]</w:t>
+              <w:t>P2.1: Examinar o procedimento ou fluxo submetido no item Q721evi e inspecionar os canais divulgados no portal institucional para avaliar quais direitos podem ser exercidos, as formas de autenticação, o encaminhamento das solicitações, a gratuidade e o acompanhamento dos pedidos; [IR2]</w:t>
             </w:r>
           </w:p>
         </w:tc>
@@ -5319,7 +5702,7 @@
                 <w:sz w:val="18"/>
                 <w:szCs w:val="18"/>
               </w:rPr>
-              <w:t>E1: Registro da resposta e dos comentários da questão Q71 sobre elaboração e divulgação da Política de Privacidade; [P1]</w:t>
+              <w:t>E1: Registro da resposta da questão Q71 sobre elaboração e divulgação da Política de Privacidade; [P1]</w:t>
             </w:r>
           </w:p>
           <w:p ns2:paraId="1E80855F" ns2:textId="1D853748">
@@ -5340,7 +5723,7 @@
                 <w:sz w:val="18"/>
                 <w:szCs w:val="18"/>
               </w:rPr>
-              <w:t>E1.1: Resultado da análise da política Q711, com registro de aprovação, vigência, clareza, acessibilidade, conteúdo mínimo e eventuais inconsistências com a declaração; [P1.1]</w:t>
+              <w:t>E1.1: Resultado da análise da política Q711evi, com registro de aprovação, vigência, clareza, acessibilidade, conteúdo mínimo e eventuais inconsistências com a declaração; [P1.1]</w:t>
             </w:r>
           </w:p>
           <w:p ns2:paraId="1E80855F" ns2:textId="1D853748">
@@ -5382,7 +5765,7 @@
                 <w:sz w:val="18"/>
                 <w:szCs w:val="18"/>
               </w:rPr>
-              <w:t>E2: Registro da resposta e dos comentários da questão Q72 sobre os mecanismos de atendimento aos direitos dos titulares; [P2]</w:t>
+              <w:t>E2: Registro da resposta da questão Q72 sobre os mecanismos de atendimento aos direitos dos titulares; [P2]</w:t>
             </w:r>
           </w:p>
           <w:p ns2:paraId="1E80855F" ns2:textId="1D853748">
@@ -5403,7 +5786,7 @@
                 <w:sz w:val="18"/>
                 <w:szCs w:val="18"/>
               </w:rPr>
-              <w:t>E2.1: Resultado do exame do documento Q72evi e da inspeção dos canais de atendimento, com indicação dos direitos atendidos, formas de autenticação, fluxo, gratuidade e eventuais inconsistências com a declaração; [P2.1]</w:t>
+              <w:t>E2.1: Resultado do exame do documento Q721evi e da inspeção dos canais de atendimento, com indicação dos direitos atendidos, formas de autenticação, fluxo, gratuidade e eventuais inconsistências com a declaração; [P2.1]</w:t>
             </w:r>
           </w:p>
         </w:tc>
@@ -5456,7 +5839,7 @@
                 <w:sz w:val="18"/>
                 <w:szCs w:val="18"/>
               </w:rPr>
-              <w:t>• Ausência de elaboração ou falta de divulgação pública de Política de Privacidade no sítio eletrônico institucional da prefeitura. [R5.1, P1, P1.1, P1.2, E1, E1.1, E1.2, C1, C3];</w:t>
+              <w:t>• Ausência de elaboração ou falta de divulgação pública de Política de Privacidade no sítio eletrônico institucional da prefeitura. [R5.1, P1, P1.1, P1.2, E1, E1.1, E1.2, C1, C3, C5];</w:t>
             </w:r>
           </w:p>
           <w:p ns2:paraId="11118515" ns2:textId="02403B9E">
@@ -5479,7 +5862,7 @@
                 <w:sz w:val="18"/>
                 <w:szCs w:val="18"/>
               </w:rPr>
-              <w:t>• Ausência ou incompletude de mecanismos implementados para atendimento às requisições e direitos dos titulares de dados pessoais. [R5.2, P2, P2.1, E2, E2.1, C2, C4];</w:t>
+              <w:t>• Ausência ou incompletude de mecanismos implementados para atendimento às requisições e direitos dos titulares de dados pessoais. [R5.2, P2, P2.1, E2, E2.1, C2, C4, C6];</w:t>
             </w:r>
           </w:p>
         </w:tc>
@@ -5527,6 +5910,13 @@
               </w:rPr>
             </w:pPr>
             <w:r>
+              <w:rPr>
+                <w:b/>
+                <w:bCs/>
+                <w:rFonts w:ascii="Arial" w:hAnsi="Arial" w:cs="Arial" w:eastAsia="Arial"/>
+                <w:sz w:val="20"/>
+                <w:szCs w:val="20"/>
+              </w:rPr>
               <w:t>Q6: A organização implementou medidas técnicas e administrativas a fim de assegurar a segurança da informação e privacidade?</w:t>
             </w:r>
           </w:p>
@@ -5548,7 +5938,7 @@
             </w:pPr>
             <w:r>
               <w:rPr>
-                <w:rFonts w:ascii="Arial" w:hAnsi="Arial" w:cs="Arial"/>
+                <w:rFonts w:ascii="Arial" w:hAnsi="Arial" w:cs="Arial" w:eastAsia="Arial"/>
                 <w:sz w:val="20"/>
                 <w:szCs w:val="20"/>
               </w:rPr>
@@ -5573,7 +5963,7 @@
             </w:pPr>
             <w:r>
               <w:rPr>
-                <w:rFonts w:ascii="Arial" w:hAnsi="Arial" w:cs="Arial"/>
+                <w:rFonts w:ascii="Arial" w:hAnsi="Arial" w:cs="Arial" w:eastAsia="Arial"/>
                 <w:sz w:val="20"/>
                 <w:szCs w:val="20"/>
               </w:rPr>
@@ -5598,7 +5988,32 @@
             </w:pPr>
             <w:r>
               <w:rPr>
-                <w:rFonts w:ascii="Arial" w:hAnsi="Arial" w:cs="Arial"/>
+                <w:rFonts w:ascii="Arial" w:hAnsi="Arial" w:cs="Arial" w:eastAsia="Arial"/>
+                <w:sz w:val="20"/>
+                <w:szCs w:val="20"/>
+              </w:rPr>
+              <w:t>A organização utiliza firewall de aplicação ou de rede e mecanismos de proteção do correio eletrônico contra spam, conteúdo malicioso e códigos maliciosos?</w:t>
+            </w:r>
+          </w:p>
+          <w:p ns2:paraId="4ED18313" ns2:textId="42BA0AFF">
+            <w:pPr>
+              <w:pStyle w:val="1012"/>
+              <w:numPr>
+                <w:ilvl w:val="0"/>
+                <w:numId w:val="4"/>
+              </w:numPr>
+              <w:pBdr/>
+              <w:spacing/>
+              <w:ind/>
+              <w:rPr>
+                <w:rFonts w:ascii="Arial" w:hAnsi="Arial" w:cs="Arial"/>
+                <w:sz w:val="20"/>
+                <w:szCs w:val="20"/>
+              </w:rPr>
+            </w:pPr>
+            <w:r>
+              <w:rPr>
+                <w:rFonts w:ascii="Arial" w:hAnsi="Arial" w:cs="Arial" w:eastAsia="Arial"/>
                 <w:sz w:val="20"/>
                 <w:szCs w:val="20"/>
               </w:rPr>
@@ -5623,7 +6038,7 @@
             </w:pPr>
             <w:r>
               <w:rPr>
-                <w:rFonts w:ascii="Arial" w:hAnsi="Arial" w:cs="Arial"/>
+                <w:rFonts w:ascii="Arial" w:hAnsi="Arial" w:cs="Arial" w:eastAsia="Arial"/>
                 <w:sz w:val="20"/>
                 <w:szCs w:val="20"/>
               </w:rPr>
@@ -5648,7 +6063,7 @@
             </w:pPr>
             <w:r>
               <w:rPr>
-                <w:rFonts w:ascii="Arial" w:hAnsi="Arial" w:cs="Arial"/>
+                <w:rFonts w:ascii="Arial" w:hAnsi="Arial" w:cs="Arial" w:eastAsia="Arial"/>
                 <w:sz w:val="20"/>
                 <w:szCs w:val="20"/>
               </w:rPr>
@@ -6030,7 +6445,7 @@
                 <w:sz w:val="18"/>
                 <w:szCs w:val="18"/>
               </w:rPr>
-              <w:t>IR1: Resposta sobre processo formal de concessão de acessos, logs e uso de criptografia; [F1, Q101[SQ002], Q101[SQ003], Q101[SQ004], Q101[SQ005]]</w:t>
+              <w:t>IR1: Resposta sobre processo formal de concessão de acessos, logs, uso de criptografia, firewall de aplicação ou de rede e proteção do correio eletrônico; [F1, Q101[SQ002], Q101[SQ003], Q101[SQ004], Q101[SQ005], Q101[SQ010], Q101[SQ011]]</w:t>
             </w:r>
           </w:p>
           <w:p ns2:paraId="1DD0E491" ns2:textId="77777777">
@@ -6053,7 +6468,7 @@
                 <w:sz w:val="18"/>
                 <w:szCs w:val="18"/>
               </w:rPr>
-              <w:t>IR2: Resposta e documento do Plano de Resposta a Incidentes de Segurança com dados pessoais; [F1, F2, Q91[SQ001], Q911]</w:t>
+              <w:t>IR2: Resposta e documento do Plano de Resposta a Incidentes de Segurança com dados pessoais; [F1, F2, Q91[SQ001], Q911evi]</w:t>
             </w:r>
           </w:p>
           <w:p ns2:paraId="1DD0E491" ns2:textId="77777777">
@@ -6099,7 +6514,7 @@
                 <w:sz w:val="18"/>
                 <w:szCs w:val="18"/>
               </w:rPr>
-              <w:t>IR4: Resposta e instrumentos contratuais sobre a adequação dos ajustes com operadores de TI e provedores de nuvem; [F1, F2, Q31[SQ005], Q31evi, Q812[SQ001], Q812[SQ004], Q812evi]</w:t>
+              <w:t>IR4: Resposta e instrumentos contratuais sobre a adequação dos ajustes com operadores de TI e provedores de nuvem; [F1, F2, Q31[SQ005], Q312evi, Q812[SQ001], Q812[SQ004], Q8121evi]</w:t>
             </w:r>
           </w:p>
         </w:tc>
@@ -6256,7 +6671,7 @@
                 <w:sz w:val="18"/>
                 <w:szCs w:val="18"/>
               </w:rPr>
-              <w:t>C6: Acórdão nº 3931/2025 do Plenário do TCE-RJ (Processo TCE-RJ nº 217.899-0/2024), Voto do Relator, item 1.10 — Determinação aos jurisdicionados para instituir formalmente e manter atualizado Plano de Resposta a Incidentes, conforme disposto no art. 48 e art. 50, § 2º, I, "g", da LGPD.</w:t>
+              <w:t>C6: Guia do Framework de Privacidade e Segurança da Informação — PPSI 2.0, medidas 6.1, 6.2, 8.1 e 8.2 — Orienta estabelecer processos de concessão e revogação de acessos e processo de gestão de logs que abranja coleta, revisão, armazenamento e habilitação dos registros nos ativos e nas soluções de software aplicáveis.</w:t>
             </w:r>
           </w:p>
           <w:p ns2:paraId="2667BB09" ns2:textId="2C1623C1">
@@ -6281,7 +6696,7 @@
                 <w:sz w:val="18"/>
                 <w:szCs w:val="18"/>
               </w:rPr>
-              <w:t>C7: Acórdão nº 3931/2025 do Plenário do TCE-RJ (Processo TCE-RJ nº 217.899-0/2024), Voto do Relator, item 1.11 — Determinação aos jurisdicionados para estabelecer procedimento alinhado ao Plano de Resposta a Incidentes para comunicar violações de dados à ANPD e aos titulares, em atendimento ao art. 48 da LGPD e à Resolução CD/ANPD nº 15/2024.</w:t>
+              <w:t>C7: Guia do Framework de Privacidade e Segurança da Informação — PPSI 2.0, medidas 17.4 e 20.1 — Orienta manter processo documentado de gestão de incidentes de segurança e de incidentes com dados pessoais, com funções, responsabilidades, fluxo de tratamento, registro de evidências, plano de resposta e comunicação à ANPD e aos titulares quando cabível.</w:t>
             </w:r>
           </w:p>
           <w:p ns2:paraId="2667BB09" ns2:textId="2C1623C1">
@@ -6306,7 +6721,7 @@
                 <w:sz w:val="18"/>
                 <w:szCs w:val="18"/>
               </w:rPr>
-              <w:t>C8: Acórdão nº 3931/2025 do Plenário do TCE-RJ (Processo TCE-RJ nº 217.899-0/2024), Voto do Relator, item 1.15 — Recomendação aos jurisdicionados para adoção de medidas técnicas e administrativas de segurança (gestão de acessos, criptografia TLS/HTTPS e repouso, firewall e proteção de perímetro).</w:t>
+              <w:t>C8: Acórdão nº 3931/2025 do Plenário do TCE-RJ (Processo TCE-RJ nº 217.899-0/2024), Voto do Relator, item 1.10 — Determinação aos jurisdicionados para instituir formalmente e manter atualizado Plano de Resposta a Incidentes, conforme disposto no art. 48 e art. 50, § 2º, I, "g", da LGPD.</w:t>
             </w:r>
           </w:p>
           <w:p ns2:paraId="2667BB09" ns2:textId="2C1623C1">
@@ -6331,7 +6746,82 @@
                 <w:sz w:val="18"/>
                 <w:szCs w:val="18"/>
               </w:rPr>
-              <w:t>C9: ABNT NBR ISO/IEC 27002:2022, controle 5.15, controle 5.16, controle 5.18, controles 5.24 a 5.27, controle 8.15 e controle 8.24 — Orienta a implementação do controle de acesso, da gestão de identidades e direitos de acesso, do registro de eventos, do uso de criptografia e da gestão de incidentes de segurança da informação.</w:t>
+              <w:t>C9: Acórdão nº 3931/2025 do Plenário do TCE-RJ (Processo TCE-RJ nº 217.899-0/2024), Voto do Relator, item 1.11 — Determinação aos jurisdicionados para estabelecer procedimento alinhado ao Plano de Resposta a Incidentes para comunicar violações de dados à ANPD e aos titulares, em atendimento ao art. 48 da LGPD e à Resolução CD/ANPD nº 15/2024.</w:t>
+            </w:r>
+          </w:p>
+          <w:p ns2:paraId="2667BB09" ns2:textId="2C1623C1">
+            <w:pPr>
+              <w:pStyle w:val="1010"/>
+              <w:pBdr/>
+              <w:spacing w:after="120"/>
+              <w:ind/>
+              <w:jc w:val="both"/>
+              <w:rPr>
+                <w:bCs/>
+                <w:color w:val="auto"/>
+                <w:sz w:val="18"/>
+                <w:szCs w:val="18"/>
+                <w:vertAlign w:val="superscript"/>
+              </w:rPr>
+            </w:pPr>
+            <w:r>
+              <w:rPr>
+                <w:bCs/>
+                <w:color w:val="auto"/>
+                <w:sz w:val="18"/>
+                <w:szCs w:val="18"/>
+              </w:rPr>
+              <w:t>C10: Acórdão nº 3931/2025 do Plenário do TCE-RJ (Processo TCE-RJ nº 217.899-0/2024), Voto do Relator, item 1.15 — Recomendação aos jurisdicionados para adoção de processo formal de registro e cancelamento de usuários, criptografia TLS/HTTPS ou de ponta a ponta, firewall de aplicação ou de rede e proteção do correio eletrônico por antispam, filtros de conteúdo e antimalware.</w:t>
+            </w:r>
+          </w:p>
+          <w:p ns2:paraId="2667BB09" ns2:textId="2C1623C1">
+            <w:pPr>
+              <w:pStyle w:val="1010"/>
+              <w:pBdr/>
+              <w:spacing w:after="120"/>
+              <w:ind/>
+              <w:jc w:val="both"/>
+              <w:rPr>
+                <w:bCs/>
+                <w:color w:val="auto"/>
+                <w:sz w:val="18"/>
+                <w:szCs w:val="18"/>
+                <w:vertAlign w:val="superscript"/>
+              </w:rPr>
+            </w:pPr>
+            <w:r>
+              <w:rPr>
+                <w:bCs/>
+                <w:color w:val="auto"/>
+                <w:sz w:val="18"/>
+                <w:szCs w:val="18"/>
+              </w:rPr>
+              <w:t>C11: Guia do Framework de Privacidade e Segurança da Informação — PPSI 2.0, medidas 15.4, 22.1 e 22.4 — Orienta incluir, nos contratos com provedores e agentes de tratamento, requisitos de segurança, papéis, responsabilidades e salvaguardas de proteção de dados, bem como revisar e adaptar os instrumentos vigentes.</w:t>
+            </w:r>
+          </w:p>
+          <w:p ns2:paraId="2667BB09" ns2:textId="2C1623C1">
+            <w:pPr>
+              <w:pStyle w:val="1010"/>
+              <w:pBdr/>
+              <w:spacing w:after="120"/>
+              <w:ind/>
+              <w:jc w:val="both"/>
+              <w:rPr>
+                <w:bCs/>
+                <w:color w:val="auto"/>
+                <w:sz w:val="18"/>
+                <w:szCs w:val="18"/>
+                <w:vertAlign w:val="superscript"/>
+              </w:rPr>
+            </w:pPr>
+            <w:r>
+              <w:rPr>
+                <w:bCs/>
+                <w:color w:val="auto"/>
+                <w:sz w:val="18"/>
+                <w:szCs w:val="18"/>
+              </w:rPr>
+              <w:t>C12: ABNT NBR ISO/IEC 27002:2022, controle 5.15, controle 5.16, controle 5.18, controles 5.24 a 5.27, controle 8.15 e controle 8.24 — Orienta a implementação do controle de acesso, da gestão de identidades e direitos de acesso, do registro de eventos, do uso de criptografia e da gestão de incidentes de segurança da informação.</w:t>
             </w:r>
           </w:p>
         </w:tc>
@@ -6362,7 +6852,7 @@
                 <w:sz w:val="18"/>
                 <w:szCs w:val="18"/>
               </w:rPr>
-              <w:t>P1: Verificar nas respostas aos itens Q101[SQ002] a Q101[SQ005] se a organização declarou possuir processo formal de concessão de acessos, logs de sistemas e uso de criptografia; [IR1]</w:t>
+              <w:t>P1: Verificar nas respostas aos itens Q101[SQ002] a Q101[SQ005], Q101[SQ010] e Q101[SQ011] se a organização declarou possuir processo formal de concessão de acessos, logs de sistemas, uso de criptografia, firewall de aplicação ou de rede e proteção do correio eletrônico; [IR1]</w:t>
             </w:r>
           </w:p>
           <w:p ns2:paraId="4C6E5B2E" ns2:textId="42100C78">
@@ -6410,7 +6900,7 @@
                 <w:sz w:val="18"/>
                 <w:szCs w:val="18"/>
               </w:rPr>
-              <w:t>P2.1: Examinar o documento submetido no item Q911 para avaliar aprovação, vigência, papéis e responsabilidades, critérios de gravidade, fluxos de detecção, contenção, comunicação e recuperação e periodicidade de revisão e testes; [IR2]</w:t>
+              <w:t>P2.1: Examinar o documento submetido no item Q911evi para avaliar aprovação, vigência, papéis e responsabilidades, critérios de gravidade, fluxos de detecção, contenção, comunicação e recuperação e periodicidade de revisão e testes; [IR2]</w:t>
             </w:r>
           </w:p>
           <w:p ns2:paraId="4C6E5B2E" ns2:textId="42100C78">
@@ -6482,7 +6972,7 @@
                 <w:sz w:val="18"/>
                 <w:szCs w:val="18"/>
               </w:rPr>
-              <w:t>P4.1: Examinar os instrumentos contratuais submetidos nos itens Q31evi e Q812evi para avaliar a existência de cláusulas sobre objeto e finalidade do tratamento, instruções do controlador, confidencialidade, medidas de segurança, subcontratação, comunicação de incidentes, devolução ou eliminação dos dados e responsabilidades das partes; [IR4]</w:t>
+              <w:t>P4.1: Examinar os instrumentos contratuais submetidos nos itens Q312evi e Q8121evi para avaliar a existência de cláusulas sobre objeto e finalidade do tratamento, instruções do controlador, confidencialidade, medidas de segurança, subcontratação, comunicação de incidentes, devolução ou eliminação dos dados e responsabilidades das partes; [IR4]</w:t>
             </w:r>
           </w:p>
         </w:tc>
@@ -6510,7 +7000,7 @@
                 <w:sz w:val="18"/>
                 <w:szCs w:val="18"/>
               </w:rPr>
-              <w:t>E1: Registro das respostas aos itens Q101[SQ002] a Q101[SQ005] sobre controle de acessos, logs de sistemas e uso de criptografia; [P1]</w:t>
+              <w:t>E1: Registro das respostas aos itens Q101[SQ002] a Q101[SQ005], Q101[SQ010] e Q101[SQ011] sobre controle de acessos, logs de sistemas, uso de criptografia, firewall de aplicação ou de rede e proteção do correio eletrônico; [P1]</w:t>
             </w:r>
           </w:p>
           <w:p ns2:paraId="1E80855F" ns2:textId="1D853748">
@@ -6552,7 +7042,7 @@
                 <w:sz w:val="18"/>
                 <w:szCs w:val="18"/>
               </w:rPr>
-              <w:t>E2.1: Resultado da análise do plano Q911, com registro de aprovação, vigência, conteúdo mínimo e eventuais inconsistências com a declaração; [P2.1]</w:t>
+              <w:t>E2.1: Resultado da análise do plano Q911evi, com registro de aprovação, vigência, conteúdo mínimo e eventuais inconsistências com a declaração; [P2.1]</w:t>
             </w:r>
           </w:p>
           <w:p ns2:paraId="1E80855F" ns2:textId="1D853748">
@@ -6615,7 +7105,7 @@
                 <w:sz w:val="18"/>
                 <w:szCs w:val="18"/>
               </w:rPr>
-              <w:t>E4.1: Resultado da análise dos instrumentos contratuais Q31evi e Q812evi, com registro das cláusulas de proteção de dados existentes, ausentes ou insuficientes e de eventuais inconsistências com a declaração; [P4.1]</w:t>
+              <w:t>E4.1: Resultado da análise dos instrumentos contratuais Q312evi e Q8121evi, com registro das cláusulas de proteção de dados existentes, ausentes ou insuficientes e de eventuais inconsistências com a declaração; [P4.1]</w:t>
             </w:r>
           </w:p>
         </w:tc>
@@ -6668,7 +7158,7 @@
                 <w:sz w:val="18"/>
                 <w:szCs w:val="18"/>
               </w:rPr>
-              <w:t>• Deficiência nos controles formais de acesso e inexistência de rastreabilidade (logs) em sistemas municipais. [R6.1, P1, E1, C1, C8, C9];</w:t>
+              <w:t>• Deficiência nos controles formais de acesso e inexistência de rastreabilidade (logs) em sistemas municipais. [R6.1, P1, E1, C1, C6, C10, C12];</w:t>
             </w:r>
           </w:p>
           <w:p ns2:paraId="11118515" ns2:textId="02403B9E">
@@ -6691,7 +7181,7 @@
                 <w:sz w:val="18"/>
                 <w:szCs w:val="18"/>
               </w:rPr>
-              <w:t>• Inexistência de Plano de Resposta a Incidentes de Segurança da Informação envolvendo dados pessoais. [R6.2, P2, P2.1, E2, E2.1, C1, C4, C6, C9];</w:t>
+              <w:t>• Inexistência de Plano de Resposta a Incidentes de Segurança da Informação envolvendo dados pessoais. [R6.2, P2, P2.1, E2, E2.1, C1, C4, C7, C8, C12];</w:t>
             </w:r>
           </w:p>
           <w:p ns2:paraId="11118515" ns2:textId="02403B9E">
@@ -6714,7 +7204,7 @@
                 <w:sz w:val="18"/>
                 <w:szCs w:val="18"/>
               </w:rPr>
-              <w:t>• Ausência de procedimento padronizado para comunicação tempestiva de incidentes de segurança à ANPD e aos titulares. [R6.2, P3, E3, C2, C3, C7];</w:t>
+              <w:t>• Ausência de procedimento padronizado para comunicação tempestiva de incidentes de segurança à ANPD e aos titulares. [R6.2, P3, E3, C2, C3, C7, C9];</w:t>
             </w:r>
           </w:p>
           <w:p ns2:paraId="11118515" ns2:textId="02403B9E">
@@ -6737,7 +7227,7 @@
                 <w:sz w:val="18"/>
                 <w:szCs w:val="18"/>
               </w:rPr>
-              <w:t>• Inexistência de cláusulas de proteção de dados e salvaguardas nos contratos firmados com operadores de TI e provedores de nuvem. [R6.3, P4, P4.1, E4, E4.1, C5];</w:t>
+              <w:t>• Inexistência de cláusulas de proteção de dados e salvaguardas nos contratos firmados com operadores de TI e provedores de nuvem. [R6.3, P4, P4.1, E4, E4.1, C5, C11];</w:t>
             </w:r>
           </w:p>
         </w:tc>
@@ -6785,7 +7275,14 @@
               </w:rPr>
             </w:pPr>
             <w:r>
-              <w:t>QT1: Qual é o grau de cumprimento, pelas prefeituras municipais, das decisões proferidas pelo TCE-RJ no Processo nº 217.899-0/2024 (Acórdão nº 3931/2025), inferido a partir das respostas aos controles correspondentes no questionário de 2026? (levantamento)</w:t>
+              <w:rPr>
+                <w:b/>
+                <w:bCs/>
+                <w:rFonts w:ascii="Arial" w:hAnsi="Arial" w:cs="Arial" w:eastAsia="Arial"/>
+                <w:sz w:val="20"/>
+                <w:szCs w:val="20"/>
+              </w:rPr>
+              <w:t>QT1: Qual é o grau de cumprimento, pelas prefeituras municipais, das decisões proferidas pelo TCE-RJ no Processo nº 217.899-0/2024 (Acórdão nº 3931/2025), e quais causas, dificuldades e impedimentos foram declarados para o não cumprimento dos respectivos encaminhamentos? (levantamento)</w:t>
             </w:r>
           </w:p>
           <w:p ns2:paraId="4ED18313" ns2:textId="42BA0AFF">
@@ -6806,11 +7303,11 @@
             </w:pPr>
             <w:r>
               <w:rPr>
-                <w:rFonts w:ascii="Arial" w:hAnsi="Arial" w:cs="Arial"/>
+                <w:rFonts w:ascii="Arial" w:hAnsi="Arial" w:cs="Arial" w:eastAsia="Arial"/>
                 <w:sz w:val="20"/>
                 <w:szCs w:val="20"/>
               </w:rPr>
-              <w:t>Os municípios implementaram as determinações e recomendações formuladas no Acórdão nº 3931/2025 no âmbito do Processo TCE-RJ nº 217.899-0/2024?</w:t>
+              <w:t>Os municípios implementaram as determinações e recomendações dos itens 1.1 a 1.15 do Voto condutor do Acórdão nº 3931/2025?</w:t>
             </w:r>
           </w:p>
           <w:p ns2:paraId="4ED18313" ns2:textId="42BA0AFF">
@@ -6831,11 +7328,11 @@
             </w:pPr>
             <w:r>
               <w:rPr>
-                <w:rFonts w:ascii="Arial" w:hAnsi="Arial" w:cs="Arial"/>
+                <w:rFonts w:ascii="Arial" w:hAnsi="Arial" w:cs="Arial" w:eastAsia="Arial"/>
                 <w:sz w:val="20"/>
                 <w:szCs w:val="20"/>
               </w:rPr>
-              <w:t>Quais prefeituras reincidiram na ausência de controles específicos objeto da decisão prévia, confrontando as respostas do questionário de 2026 com os encaminhamentos individualizados de 2024?</w:t>
+              <w:t>Quais prefeituras reincidiram na ausência dos controles objeto dos 12 encaminhamentos individualizados em 2024, conforme o baseline aplicável a cada município?</w:t>
             </w:r>
           </w:p>
           <w:p ns2:paraId="4ED18313" ns2:textId="42BA0AFF">
@@ -6856,47 +7353,61 @@
             </w:pPr>
             <w:r>
               <w:rPr>
-                <w:rFonts w:ascii="Arial" w:hAnsi="Arial" w:cs="Arial"/>
+                <w:rFonts w:ascii="Arial" w:hAnsi="Arial" w:cs="Arial" w:eastAsia="Arial"/>
                 <w:sz w:val="20"/>
                 <w:szCs w:val="20"/>
               </w:rPr>
-              <w:t>Como se distribuem os casos de cumprimento e descumprimento entre os 12 temas de controle monitorados (Encarregado/DPO, divulgação do DPO no portal, PSI, Política de Classificação da Informação, Política de Proteção de Dados, Plano de Capacitação, Inventário de Dados Pessoais, RIPD, Política de Privacidade no portal, Mecanismos para Direitos dos Titulares, Plano de Resposta a Incidentes e Notificação à ANPD/titulares)?</w:t>
+              <w:t>Quais causas, dificuldades e impedimentos foram declarados pelos municípios que não implementaram integralmente cada encaminhamento?</w:t>
             </w:r>
           </w:p>
-        </w:tc>
-      </w:tr>
-      <w:tr>
-        <w:trPr>
-          <w:tblHeader/>
-        </w:trPr>
-        <w:tc>
-          <w:tcPr>
-            <w:gridSpan w:val="6"/>
-            <w:shd w:val="clear" w:color="auto" w:fill="bdd6ee" w:themeFill="accent5" w:themeFillTint="66"/>
-            <w:tcBorders/>
-            <w:tcW w:w="5000" w:type="pct"/>
-          </w:tcPr>
-          <w:p ns2:paraId="63566D7E" ns2:textId="69F154AC">
+          <w:p ns2:paraId="4ED18313" ns2:textId="42BA0AFF">
             <w:pPr>
+              <w:pStyle w:val="1012"/>
+              <w:numPr>
+                <w:ilvl w:val="0"/>
+                <w:numId w:val="4"/>
+              </w:numPr>
               <w:pBdr/>
-              <w:spacing w:after="120"/>
+              <w:spacing/>
               <w:ind/>
-              <w:jc w:val="both"/>
-              <w:rPr>
-                <w:rFonts w:ascii="Arial" w:hAnsi="Arial" w:cs="Arial"/>
-                <w:b/>
+              <w:rPr>
+                <w:rFonts w:ascii="Arial" w:hAnsi="Arial" w:cs="Arial"/>
                 <w:sz w:val="20"/>
                 <w:szCs w:val="20"/>
               </w:rPr>
             </w:pPr>
             <w:r>
               <w:rPr>
-                <w:rFonts w:ascii="Arial" w:hAnsi="Arial" w:cs="Arial"/>
-                <w:b/>
+                <w:rFonts w:ascii="Arial" w:hAnsi="Arial" w:cs="Arial" w:eastAsia="Arial"/>
                 <w:sz w:val="20"/>
                 <w:szCs w:val="20"/>
               </w:rPr>
-              <w:t>Não se aplica: questão de levantamento, sem formulação de risco de achado.</w:t>
+              <w:t>Quais dificuldades foram declaradas pelos municípios que implementaram cada encaminhamento e como elas foram superadas?</w:t>
+            </w:r>
+          </w:p>
+          <w:p ns2:paraId="4ED18313" ns2:textId="42BA0AFF">
+            <w:pPr>
+              <w:pStyle w:val="1012"/>
+              <w:numPr>
+                <w:ilvl w:val="0"/>
+                <w:numId w:val="4"/>
+              </w:numPr>
+              <w:pBdr/>
+              <w:spacing/>
+              <w:ind/>
+              <w:rPr>
+                <w:rFonts w:ascii="Arial" w:hAnsi="Arial" w:cs="Arial"/>
+                <w:sz w:val="20"/>
+                <w:szCs w:val="20"/>
+              </w:rPr>
+            </w:pPr>
+            <w:r>
+              <w:rPr>
+                <w:rFonts w:ascii="Arial" w:hAnsi="Arial" w:cs="Arial" w:eastAsia="Arial"/>
+                <w:sz w:val="20"/>
+                <w:szCs w:val="20"/>
+              </w:rPr>
+              <w:t>Como se distribuem o cumprimento, o não cumprimento e as causas declaradas por item do Acórdão, município e categoria analítica?</w:t>
             </w:r>
           </w:p>
         </w:tc>
@@ -6910,12 +7421,11 @@
         <w:tblLook w:val="04A0" w:firstRow="1" w:lastRow="0" w:firstColumn="1" w:lastColumn="0" w:noHBand="0" w:noVBand="1"/>
       </w:tblPr>
       <w:tblGrid>
-        <w:gridCol w:w="2258"/>
-        <w:gridCol w:w="3170"/>
-        <w:gridCol w:w="3622"/>
-        <w:gridCol w:w="4530"/>
-        <w:gridCol w:w="4078"/>
-        <w:gridCol w:w="4700"/>
+        <w:gridCol w:w="2991"/>
+        <w:gridCol w:w="4199"/>
+        <w:gridCol w:w="3553"/>
+        <w:gridCol w:w="5401"/>
+        <w:gridCol w:w="6224"/>
       </w:tblGrid>
       <w:tr>
         <w:trPr>
@@ -6924,7 +7434,7 @@
         <w:tc>
           <w:tcPr>
             <w:tcBorders/>
-            <w:tcW w:w="2259" w:type="dxa"/>
+            <w:tcW w:w="2991" w:type="dxa"/>
             <w:vAlign w:val="center"/>
           </w:tcPr>
           <w:p ns2:paraId="5C2D7232" ns2:textId="280A56F4">
@@ -6956,7 +7466,7 @@
         <w:tc>
           <w:tcPr>
             <w:tcBorders/>
-            <w:tcW w:w="3172" w:type="dxa"/>
+            <w:tcW w:w="4199" w:type="dxa"/>
             <w:vAlign w:val="center"/>
           </w:tcPr>
           <w:p ns2:paraId="7208CA25" ns2:textId="5376F66C">
@@ -6988,39 +7498,7 @@
         <w:tc>
           <w:tcPr>
             <w:tcBorders/>
-            <w:tcW w:w="5471" w:type="dxa"/>
-            <w:vAlign w:val="center"/>
-          </w:tcPr>
-          <w:p ns2:paraId="563FD7FD" ns2:textId="77777777">
-            <w:pPr>
-              <w:pBdr/>
-              <w:spacing w:after="0" w:before="40"/>
-              <w:ind/>
-              <w:jc w:val="center"/>
-              <w:rPr>
-                <w:rFonts w:ascii="Arial" w:hAnsi="Arial" w:cs="Arial"/>
-                <w:b/>
-                <w:bCs/>
-                <w:sz w:val="16"/>
-                <w:szCs w:val="16"/>
-              </w:rPr>
-            </w:pPr>
-            <w:r>
-              <w:rPr>
-                <w:rFonts w:ascii="Arial" w:hAnsi="Arial" w:cs="Arial"/>
-                <w:b/>
-                <w:bCs/>
-                <w:sz w:val="16"/>
-                <w:szCs w:val="16"/>
-              </w:rPr>
-              <w:t>CRITÉRIOS</w:t>
-            </w:r>
-          </w:p>
-        </w:tc>
-        <w:tc>
-          <w:tcPr>
-            <w:tcBorders/>
-            <w:tcW w:w="2684" w:type="dxa"/>
+            <w:tcW w:w="3553" w:type="dxa"/>
             <w:vAlign w:val="center"/>
           </w:tcPr>
           <w:p ns2:paraId="6A4DEA23" ns2:textId="77777777">
@@ -7053,7 +7531,7 @@
         <w:tc>
           <w:tcPr>
             <w:tcBorders/>
-            <w:tcW w:w="4080" w:type="dxa"/>
+            <w:tcW w:w="5401" w:type="dxa"/>
             <w:vAlign w:val="center"/>
           </w:tcPr>
           <w:p ns2:paraId="4A1C29C4" ns2:textId="77777777">
@@ -7085,7 +7563,7 @@
         <w:tc>
           <w:tcPr>
             <w:tcBorders/>
-            <w:tcW w:w="4702" w:type="dxa"/>
+            <w:tcW w:w="6224" w:type="dxa"/>
             <w:vAlign w:val="center"/>
           </w:tcPr>
           <w:p ns2:paraId="357B1101" ns2:textId="77777777">
@@ -7120,7 +7598,7 @@
         <w:tc>
           <w:tcPr>
             <w:tcBorders/>
-            <w:tcW w:w="2259" w:type="dxa"/>
+            <w:tcW w:w="2991" w:type="dxa"/>
             <w:vAlign w:val="center"/>
           </w:tcPr>
           <w:p ns2:paraId="07477FA7" ns2:textId="4BBAC042">
@@ -7190,7 +7668,7 @@
         <w:tc>
           <w:tcPr>
             <w:tcBorders/>
-            <w:tcW w:w="3172" w:type="dxa"/>
+            <w:tcW w:w="4199" w:type="dxa"/>
             <w:vAlign w:val="center"/>
           </w:tcPr>
           <w:p ns2:paraId="1DD0E491" ns2:textId="77777777">
@@ -7213,7 +7691,7 @@
                 <w:sz w:val="18"/>
                 <w:szCs w:val="18"/>
               </w:rPr>
-              <w:t>IR1: Baseline de deliberações e controles esperados por município estabelecido a partir da tabela_encaminhamentos.xlsx e da tabela_situacao_encontrada.xlsx da fiscalização de 2024; [F2, F3]</w:t>
+              <w:t>IR1: Baseline por município dos 12 encaminhamentos individualizados em 2024 e identificação dos três encaminhamentos de aplicação universal, estabelecidos a partir da tabela_encaminhamentos.xlsx, da tabela_situacao_encontrada.xlsx e dos autos do processo; [F2, F3]</w:t>
             </w:r>
           </w:p>
           <w:p ns2:paraId="1DD0E491" ns2:textId="77777777">
@@ -7236,46 +7714,37 @@
                 <w:sz w:val="18"/>
                 <w:szCs w:val="18"/>
               </w:rPr>
-              <w:t>IR2: Respostas fornecidas pelas prefeituras no questionário de 2026 sobre os 12 controles monitorados; [F1, Q41[SQ004], Q41[SQ005], Q41[SQ001], Q41[SQ002], Q41[SQ003], Q51, Q61[SQ005], Q61[SQ008], Q71, Q72, Q91[SQ001], Q91[SQ005]]</w:t>
+              <w:t>IR2: Respostas de 2026 que permitem classificar o cumprimento dos itens 1.1 a 1.15 do Acórdão: Plano de Ação; nomeação e divulgação do Encarregado; Inventário de Dados Pessoais; elaboração e publicação da PSI e da PPDP; RIPD; política de privacidade; plano e ações de capacitação; Plano de Resposta a Incidentes; procedimento de notificação; comissão ou grupo de trabalho; Política de Classificação da Informação; e medidas técnicas e administrativas de segurança; [F1, Q24, Q41[SQ004], Q41[SQ005], Q61[SQ005], Q41[SQ001], Q416, Q41[SQ003], Q417, Q71, Q72, Q61[SQ008], Q91[SQ001], Q91[SQ005], Q22, Q51, Q41[SQ002], Q101[SQ002], Q101[SQ005], Q101[SQ010], Q101[SQ011]]</w:t>
+            </w:r>
+          </w:p>
+          <w:p ns2:paraId="1DD0E491" ns2:textId="77777777">
+            <w:pPr>
+              <w:pBdr/>
+              <w:spacing w:after="120"/>
+              <w:ind/>
+              <w:jc w:val="both"/>
+              <w:rPr>
+                <w:rFonts w:ascii="Arial" w:hAnsi="Arial" w:cs="Arial"/>
+                <w:b/>
+                <w:bCs/>
+                <w:sz w:val="18"/>
+                <w:szCs w:val="18"/>
+              </w:rPr>
+            </w:pPr>
+            <w:r>
+              <w:rPr>
+                <w:rFonts w:ascii="Arial" w:hAnsi="Arial" w:cs="Arial"/>
+                <w:sz w:val="18"/>
+                <w:szCs w:val="18"/>
+              </w:rPr>
+              <w:t>IR3: Relatos textuais sobre as dificuldades encontradas e sua superação quando o encaminhamento foi implementado, e sobre causas, dificuldades e impedimentos quando não foi integralmente implementado; [F1, QAC11S, QAC11N, QAC12S, QAC12N, QAC13S, QAC13N, QAC14S, QAC14N, QAC15S, QAC15N, QAC16S, QAC16N, QAC17S, QAC17N, QAC18S, QAC18N, QAC19S, QAC19N, QAC110S, QAC110N, QAC111S, QAC111N, QAC112S, QAC112N, QAC113S, QAC113N, QAC114S, QAC114N, QAC115S, QAC115N]</w:t>
             </w:r>
           </w:p>
         </w:tc>
         <w:tc>
           <w:tcPr>
             <w:tcBorders/>
-            <w:tcW w:w="5471" w:type="dxa"/>
-            <w:vAlign w:val="center"/>
-          </w:tcPr>
-          <w:p ns2:paraId="2667BB09" ns2:textId="2C1623C1">
-            <w:pPr>
-              <w:pStyle w:val="1010"/>
-              <w:pBdr/>
-              <w:spacing w:after="120"/>
-              <w:ind/>
-              <w:jc w:val="both"/>
-              <w:rPr>
-                <w:bCs/>
-                <w:color w:val="auto"/>
-                <w:sz w:val="18"/>
-                <w:szCs w:val="18"/>
-                <w:vertAlign w:val="superscript"/>
-              </w:rPr>
-            </w:pPr>
-            <w:r>
-              <w:rPr>
-                <w:bCs/>
-                <w:color w:val="auto"/>
-                <w:sz w:val="18"/>
-                <w:szCs w:val="18"/>
-              </w:rPr>
-              <w:t>Não se aplica como critério de conformidade: análise orientada pelas fontes e pelos procedimentos definidos.</w:t>
-            </w:r>
-          </w:p>
-        </w:tc>
-        <w:tc>
-          <w:tcPr>
-            <w:tcBorders/>
-            <w:tcW w:w="2684" w:type="dxa"/>
+            <w:tcW w:w="3553" w:type="dxa"/>
             <w:vAlign w:val="center"/>
           </w:tcPr>
           <w:p ns2:paraId="4C6E5B2E" ns2:textId="42100C78">
@@ -7299,7 +7768,7 @@
                 <w:sz w:val="18"/>
                 <w:szCs w:val="18"/>
               </w:rPr>
-              <w:t>P1: Mapear a matriz de deliberações anteriores importando a tabela_encaminhamentos.xlsx e a tabela_situacao_encontrada.xlsx de 2024 para parametrizar a aplicação de regras dinâmicas e o baseline de controles de cada prefeitura; [IR1]</w:t>
+              <w:t>P1: Reconstruir e conferir o baseline municipal por meio da importação da tabela_encaminhamentos.xlsx e da tabela_situacao_encontrada.xlsx de 2024 e da consulta aos autos, distinguindo os 12 encaminhamentos individualizados — 946 ocorrências — dos três encaminhamentos de aplicação universal; [IR1]</w:t>
             </w:r>
           </w:p>
           <w:p ns2:paraId="4C6E5B2E" ns2:textId="42100C78">
@@ -7323,7 +7792,7 @@
                 <w:sz w:val="18"/>
                 <w:szCs w:val="18"/>
               </w:rPr>
-              <w:t>P2: Confrontar as declarações de controle do questionário de 2026 com o baseline individualizado para identificar situações de reincidência e pendência no atendimento às deliberações; [IR2]</w:t>
+              <w:t>P2: Aplicar às respostas de 2026 regras baseadas nos códigos de resposta para classificar cada item como cumprimento integral ou não cumprimento integral; [IR1, IR2] Regras de cumprimento integral: item 1.1, Q24 == 'A1'; item 1.2, Q41[SQ004] == 'Y'; item 1.3, Q41[SQ005] == 'Y'; item 1.4, Q61[SQ005] == 'Y'; item 1.5, Q41[SQ001] == 'Y' e Q416 == 'A1'; item 1.6, Q41[SQ003] == 'Y' e Q417 == 'A1'; item 1.7, Q71 == 'A4'; item 1.8, Q72 == 'A4'; item 1.9, Q61[SQ008] == 'Y'; item 1.10, Q91[SQ001] == 'Y'; item 1.11, Q91[SQ005] == 'Y'; item 1.12, Q22 == 'A1'; item 1.13, Q51 in ['A5', 'A6']; item 1.14, Q41[SQ002] == 'Y'; e item 1.15, Q101[SQ002] == 'Y', Q101[SQ005] == 'Y', Q101[SQ010] == 'Y' e Q101[SQ011] == 'Y'. Classificar as demais combinações como não cumprimento integral. Para os 12 itens individualizados, considerar como monitoramento de decisão somente as combinações município-item presentes no baseline e tratar as demais respostas como informação diagnóstica. Para os itens 1.1, 1.12 e 1.15, avaliar todos os municípios.</w:t>
             </w:r>
           </w:p>
           <w:p ns2:paraId="4C6E5B2E" ns2:textId="42100C78">
@@ -7347,14 +7816,38 @@
                 <w:sz w:val="18"/>
                 <w:szCs w:val="18"/>
               </w:rPr>
-              <w:t>P3: Tabular, por município e tema, as respostas negativas ou insuficientes aos 12 controles monitorados, classificando como possível descumprimento apenas os itens constantes do baseline individualizado do respectivo município; [IR1, IR2]</w:t>
+              <w:t>P3: Examinar separadamente os relatos associados ao cumprimento e ao não cumprimento de cada item e codificá-los, admitindo múltiplas categorias por resposta: governança ou priorização; pessoal ou capacidade técnica; orçamento; contratação ou gestão contratual; tecnologia ou infraestrutura; interpretação jurídica; coordenação interna ou mapeamento de processos; descontinuidade administrativa; dependência externa; outros; e justificativa ausente ou insuficiente; [IR3]</w:t>
+            </w:r>
+          </w:p>
+          <w:p ns2:paraId="4C6E5B2E" ns2:textId="42100C78">
+            <w:pPr>
+              <w:pStyle w:val="1010"/>
+              <w:pBdr/>
+              <w:spacing w:after="120"/>
+              <w:ind/>
+              <w:jc w:val="both"/>
+              <w:rPr>
+                <w:b/>
+                <w:bCs/>
+                <w:color w:val="auto"/>
+                <w:sz w:val="18"/>
+                <w:szCs w:val="18"/>
+              </w:rPr>
+            </w:pPr>
+            <w:r>
+              <w:rPr>
+                <w:color w:val="auto"/>
+                <w:sz w:val="18"/>
+                <w:szCs w:val="18"/>
+              </w:rPr>
+              <w:t>P4: Consolidar, por município, item do Acórdão e categoria analítica, as quantidades e proporções de cumprimento, não cumprimento, causas, dificuldades, impedimentos e formas de superação, mantendo separados os 12 itens individualizados e os três itens universais; [IR1, IR2, IR3]</w:t>
             </w:r>
           </w:p>
         </w:tc>
         <w:tc>
           <w:tcPr>
             <w:tcBorders/>
-            <w:tcW w:w="4080" w:type="dxa"/>
+            <w:tcW w:w="5401" w:type="dxa"/>
             <w:vAlign w:val="center"/>
           </w:tcPr>
           <w:p ns2:paraId="1E80855F" ns2:textId="1D853748">
@@ -7375,7 +7868,7 @@
                 <w:sz w:val="18"/>
                 <w:szCs w:val="18"/>
               </w:rPr>
-              <w:t>E1: Matriz comparativa de cumprimento/reincidência por deliberação monitorada e por prefeitura (cruzamento do baseline 2024 com o survey 2026); [P1, P2]</w:t>
+              <w:t>E1: Matriz do baseline de 2024 por município e item, com indicação da aplicabilidade individualizada ou universal; [P1]</w:t>
             </w:r>
           </w:p>
           <w:p ns2:paraId="1E80855F" ns2:textId="1D853748">
@@ -7396,14 +7889,56 @@
                 <w:sz w:val="18"/>
                 <w:szCs w:val="18"/>
               </w:rPr>
-              <w:t>E2: Tabela consolidada da distribuição dos casos de cumprimento e possível descumprimento por tema de controle e prefeitura; [P3]</w:t>
+              <w:t>E2: Matriz comparativa do status de cumprimento em 2026 por município e item do Acórdão, com distinção entre monitoramento de decisão e diagnóstico geral; [P2]</w:t>
+            </w:r>
+          </w:p>
+          <w:p ns2:paraId="1E80855F" ns2:textId="1D853748">
+            <w:pPr>
+              <w:pBdr/>
+              <w:spacing w:after="120"/>
+              <w:ind/>
+              <w:jc w:val="both"/>
+              <w:rPr>
+                <w:rFonts w:ascii="Arial" w:hAnsi="Arial" w:cs="Arial"/>
+                <w:sz w:val="18"/>
+                <w:szCs w:val="18"/>
+              </w:rPr>
+            </w:pPr>
+            <w:r>
+              <w:rPr>
+                <w:rFonts w:ascii="Arial" w:hAnsi="Arial" w:cs="Arial"/>
+                <w:sz w:val="18"/>
+                <w:szCs w:val="18"/>
+              </w:rPr>
+              <w:t>E3: Base de relatos codificados, com a resposta original preservada, as categorias atribuídas e a distinção entre dificuldades superadas e causas ou impedimentos do não cumprimento; [P3]</w:t>
+            </w:r>
+          </w:p>
+          <w:p ns2:paraId="1E80855F" ns2:textId="1D853748">
+            <w:pPr>
+              <w:pBdr/>
+              <w:spacing w:after="120"/>
+              <w:ind/>
+              <w:jc w:val="both"/>
+              <w:rPr>
+                <w:rFonts w:ascii="Arial" w:hAnsi="Arial" w:cs="Arial"/>
+                <w:sz w:val="18"/>
+                <w:szCs w:val="18"/>
+              </w:rPr>
+            </w:pPr>
+            <w:r>
+              <w:rPr>
+                <w:rFonts w:ascii="Arial" w:hAnsi="Arial" w:cs="Arial"/>
+                <w:sz w:val="18"/>
+                <w:szCs w:val="18"/>
+              </w:rPr>
+              <w:t>E4: Tabelas consolidadas de cumprimento, reincidência e categorias declaradas, por município e item do Acórdão; [P4]</w:t>
             </w:r>
           </w:p>
         </w:tc>
         <w:tc>
           <w:tcPr>
             <w:tcBorders/>
-            <w:tcW w:w="4702" w:type="dxa"/>
+            <w:tcW w:w="6224" w:type="dxa"/>
             <w:vAlign w:val="center"/>
           </w:tcPr>
           <w:p ns2:paraId="11118515" ns2:textId="02403B9E">
@@ -7472,7 +8007,7 @@
                 <w:sz w:val="18"/>
                 <w:szCs w:val="18"/>
               </w:rPr>
-              <w:t>O percentual consolidado e individualizado de cumprimento das 12 deliberações do Acórdão nº 3931/2025 pelas 91 prefeituras fluminenses.</w:t>
+              <w:t>O percentual consolidado e individualizado de cumprimento dos itens aplicáveis do Acórdão nº 3931/2025 pelas 91 prefeituras fluminenses, distinguindo os 12 encaminhamentos individualizados dos três encaminhamentos universais.</w:t>
             </w:r>
           </w:p>
           <w:p ns2:paraId="11118515" ns2:textId="02403B9E">
@@ -7518,7 +8053,30 @@
                 <w:sz w:val="18"/>
                 <w:szCs w:val="18"/>
               </w:rPr>
-              <w:t>A distribuição dos possíveis descumprimentos entre os 12 temas monitorados.</w:t>
+              <w:t>A distribuição dos casos de cumprimento, não cumprimento e reincidência por município e item monitorado.</w:t>
+            </w:r>
+          </w:p>
+          <w:p ns2:paraId="11118515" ns2:textId="02403B9E">
+            <w:pPr>
+              <w:pBdr/>
+              <w:spacing w:after="120"/>
+              <w:ind w:firstLine="0" w:left="0"/>
+              <w:jc w:val="both"/>
+              <w:rPr>
+                <w:rFonts w:ascii="Arial" w:hAnsi="Arial" w:cs="Arial"/>
+                <w:sz w:val="18"/>
+                <w:szCs w:val="18"/>
+              </w:rPr>
+            </w:pPr>
+            <w:r>
+              <w:rPr>
+                <w:rFonts w:ascii="Arial" w:hAnsi="Arial" w:cs="Arial"/>
+                <w:b/>
+                <w:bCs/>
+                <w:sz w:val="18"/>
+                <w:szCs w:val="18"/>
+              </w:rPr>
+              <w:t>As causas, dificuldades e impedimentos declarados para o não cumprimento, bem como as dificuldades declaradas pelos municípios que cumpriram os encaminhamentos e as formas relatadas de superação.</w:t>
             </w:r>
           </w:p>
           <w:p ns2:paraId="11118515" ns2:textId="02403B9E">
@@ -7564,7 +8122,7 @@
                 <w:sz w:val="18"/>
                 <w:szCs w:val="18"/>
               </w:rPr>
-              <w:t>A classificação decorre de respostas autodeclaradas e da correspondência entre cada resposta negativa ou insuficiente e o encaminhamento individualizado aplicável ao município.</w:t>
+              <w:t>A classificação decorre de respostas autodeclaradas e da correspondência entre cada resposta e o encaminhamento aplicável ao município.</w:t>
             </w:r>
           </w:p>
           <w:p ns2:paraId="11118515" ns2:textId="02403B9E">
@@ -7587,7 +8145,53 @@
                 <w:sz w:val="18"/>
                 <w:szCs w:val="18"/>
               </w:rPr>
-              <w:t>O questionário não coleta causas específicas para cada possível descumprimento nem percentual de execução dos planos de ação.</w:t>
+              <w:t>Embora todos os municípios respondam aos itens, para os 12 encaminhamentos individualizados somente as combinações município-item existentes no baseline de 2024 caracterizam monitoramento da decisão; as demais respostas possuem finalidade diagnóstica.</w:t>
+            </w:r>
+          </w:p>
+          <w:p ns2:paraId="11118515" ns2:textId="02403B9E">
+            <w:pPr>
+              <w:pBdr/>
+              <w:spacing w:after="120"/>
+              <w:ind w:firstLine="0" w:left="0"/>
+              <w:jc w:val="both"/>
+              <w:rPr>
+                <w:rFonts w:ascii="Arial" w:hAnsi="Arial" w:cs="Arial"/>
+                <w:sz w:val="18"/>
+                <w:szCs w:val="18"/>
+              </w:rPr>
+            </w:pPr>
+            <w:r>
+              <w:rPr>
+                <w:rFonts w:ascii="Arial" w:hAnsi="Arial" w:cs="Arial"/>
+                <w:b/>
+                <w:bCs/>
+                <w:sz w:val="18"/>
+                <w:szCs w:val="18"/>
+              </w:rPr>
+              <w:t>A categorização dos relatos textuais exige julgamento analítico, pode admitir múltiplas categorias e deve preservar a rastreabilidade até a resposta original.</w:t>
+            </w:r>
+          </w:p>
+          <w:p ns2:paraId="11118515" ns2:textId="02403B9E">
+            <w:pPr>
+              <w:pBdr/>
+              <w:spacing w:after="120"/>
+              <w:ind w:firstLine="0" w:left="0"/>
+              <w:jc w:val="both"/>
+              <w:rPr>
+                <w:rFonts w:ascii="Arial" w:hAnsi="Arial" w:cs="Arial"/>
+                <w:sz w:val="18"/>
+                <w:szCs w:val="18"/>
+              </w:rPr>
+            </w:pPr>
+            <w:r>
+              <w:rPr>
+                <w:rFonts w:ascii="Arial" w:hAnsi="Arial" w:cs="Arial"/>
+                <w:b/>
+                <w:bCs/>
+                <w:sz w:val="18"/>
+                <w:szCs w:val="18"/>
+              </w:rPr>
+              <w:t>Os relatos permitem identificar causas e dificuldades declaradas e associações recorrentes, mas não comprovam, isoladamente, relações causais.</w:t>
             </w:r>
           </w:p>
           <w:p ns2:paraId="11118515" ns2:textId="02403B9E">
@@ -7658,6 +8262,13 @@
               </w:rPr>
             </w:pPr>
             <w:r>
+              <w:rPr>
+                <w:b/>
+                <w:bCs/>
+                <w:rFonts w:ascii="Arial" w:hAnsi="Arial" w:cs="Arial" w:eastAsia="Arial"/>
+                <w:sz w:val="20"/>
+                <w:szCs w:val="20"/>
+              </w:rPr>
               <w:t>QT2: Qual é o perfil de maturidade em proteção de dados pessoais das 91 prefeituras segundo o índice iLGPD 2026, qual a evolução observada desde 2024 e qual é a avaliação dos gestores sobre a efetividade do material didático "Os 6 passos para adequação à LGPD"? (levantamento)</w:t>
             </w:r>
           </w:p>
@@ -7679,7 +8290,7 @@
             </w:pPr>
             <w:r>
               <w:rPr>
-                <w:rFonts w:ascii="Arial" w:hAnsi="Arial" w:cs="Arial"/>
+                <w:rFonts w:ascii="Arial" w:hAnsi="Arial" w:cs="Arial" w:eastAsia="Arial"/>
                 <w:sz w:val="20"/>
                 <w:szCs w:val="20"/>
               </w:rPr>
@@ -7704,7 +8315,7 @@
             </w:pPr>
             <w:r>
               <w:rPr>
-                <w:rFonts w:ascii="Arial" w:hAnsi="Arial" w:cs="Arial"/>
+                <w:rFonts w:ascii="Arial" w:hAnsi="Arial" w:cs="Arial" w:eastAsia="Arial"/>
                 <w:sz w:val="20"/>
                 <w:szCs w:val="20"/>
               </w:rPr>
@@ -7729,7 +8340,7 @@
             </w:pPr>
             <w:r>
               <w:rPr>
-                <w:rFonts w:ascii="Arial" w:hAnsi="Arial" w:cs="Arial"/>
+                <w:rFonts w:ascii="Arial" w:hAnsi="Arial" w:cs="Arial" w:eastAsia="Arial"/>
                 <w:sz w:val="20"/>
                 <w:szCs w:val="20"/>
               </w:rPr>
@@ -7754,7 +8365,7 @@
             </w:pPr>
             <w:r>
               <w:rPr>
-                <w:rFonts w:ascii="Arial" w:hAnsi="Arial" w:cs="Arial"/>
+                <w:rFonts w:ascii="Arial" w:hAnsi="Arial" w:cs="Arial" w:eastAsia="Arial"/>
                 <w:sz w:val="20"/>
                 <w:szCs w:val="20"/>
               </w:rPr>
@@ -7779,7 +8390,7 @@
             </w:pPr>
             <w:r>
               <w:rPr>
-                <w:rFonts w:ascii="Arial" w:hAnsi="Arial" w:cs="Arial"/>
+                <w:rFonts w:ascii="Arial" w:hAnsi="Arial" w:cs="Arial" w:eastAsia="Arial"/>
                 <w:sz w:val="20"/>
                 <w:szCs w:val="20"/>
               </w:rPr>
@@ -7804,7 +8415,7 @@
             </w:pPr>
             <w:r>
               <w:rPr>
-                <w:rFonts w:ascii="Arial" w:hAnsi="Arial" w:cs="Arial"/>
+                <w:rFonts w:ascii="Arial" w:hAnsi="Arial" w:cs="Arial" w:eastAsia="Arial"/>
                 <w:sz w:val="20"/>
                 <w:szCs w:val="20"/>
               </w:rPr>
@@ -7829,47 +8440,11 @@
             </w:pPr>
             <w:r>
               <w:rPr>
-                <w:rFonts w:ascii="Arial" w:hAnsi="Arial" w:cs="Arial"/>
+                <w:rFonts w:ascii="Arial" w:hAnsi="Arial" w:cs="Arial" w:eastAsia="Arial"/>
                 <w:sz w:val="20"/>
                 <w:szCs w:val="20"/>
               </w:rPr>
               <w:t>Quais são os principais desafios, deficiências estruturais e pontos de atenção relatados abertamente pelos jurisdicionados?</w:t>
-            </w:r>
-          </w:p>
-        </w:tc>
-      </w:tr>
-      <w:tr>
-        <w:trPr>
-          <w:tblHeader/>
-        </w:trPr>
-        <w:tc>
-          <w:tcPr>
-            <w:gridSpan w:val="6"/>
-            <w:shd w:val="clear" w:color="auto" w:fill="bdd6ee" w:themeFill="accent5" w:themeFillTint="66"/>
-            <w:tcBorders/>
-            <w:tcW w:w="5000" w:type="pct"/>
-          </w:tcPr>
-          <w:p ns2:paraId="63566D7E" ns2:textId="69F154AC">
-            <w:pPr>
-              <w:pBdr/>
-              <w:spacing w:after="120"/>
-              <w:ind/>
-              <w:jc w:val="both"/>
-              <w:rPr>
-                <w:rFonts w:ascii="Arial" w:hAnsi="Arial" w:cs="Arial"/>
-                <w:b/>
-                <w:sz w:val="20"/>
-                <w:szCs w:val="20"/>
-              </w:rPr>
-            </w:pPr>
-            <w:r>
-              <w:rPr>
-                <w:rFonts w:ascii="Arial" w:hAnsi="Arial" w:cs="Arial"/>
-                <w:b/>
-                <w:sz w:val="20"/>
-                <w:szCs w:val="20"/>
-              </w:rPr>
-              <w:t>Não se aplica: questão de levantamento, sem formulação de risco de achado.</w:t>
             </w:r>
           </w:p>
         </w:tc>
@@ -7883,12 +8458,11 @@
         <w:tblLook w:val="04A0" w:firstRow="1" w:lastRow="0" w:firstColumn="1" w:lastColumn="0" w:noHBand="0" w:noVBand="1"/>
       </w:tblPr>
       <w:tblGrid>
-        <w:gridCol w:w="2258"/>
-        <w:gridCol w:w="3170"/>
-        <w:gridCol w:w="3622"/>
-        <w:gridCol w:w="4530"/>
-        <w:gridCol w:w="4078"/>
-        <w:gridCol w:w="4700"/>
+        <w:gridCol w:w="2991"/>
+        <w:gridCol w:w="4199"/>
+        <w:gridCol w:w="3553"/>
+        <w:gridCol w:w="5401"/>
+        <w:gridCol w:w="6224"/>
       </w:tblGrid>
       <w:tr>
         <w:trPr>
@@ -7897,7 +8471,7 @@
         <w:tc>
           <w:tcPr>
             <w:tcBorders/>
-            <w:tcW w:w="2259" w:type="dxa"/>
+            <w:tcW w:w="2991" w:type="dxa"/>
             <w:vAlign w:val="center"/>
           </w:tcPr>
           <w:p ns2:paraId="5C2D7232" ns2:textId="280A56F4">
@@ -7929,7 +8503,7 @@
         <w:tc>
           <w:tcPr>
             <w:tcBorders/>
-            <w:tcW w:w="3172" w:type="dxa"/>
+            <w:tcW w:w="4199" w:type="dxa"/>
             <w:vAlign w:val="center"/>
           </w:tcPr>
           <w:p ns2:paraId="7208CA25" ns2:textId="5376F66C">
@@ -7961,39 +8535,7 @@
         <w:tc>
           <w:tcPr>
             <w:tcBorders/>
-            <w:tcW w:w="5471" w:type="dxa"/>
-            <w:vAlign w:val="center"/>
-          </w:tcPr>
-          <w:p ns2:paraId="563FD7FD" ns2:textId="77777777">
-            <w:pPr>
-              <w:pBdr/>
-              <w:spacing w:after="0" w:before="40"/>
-              <w:ind/>
-              <w:jc w:val="center"/>
-              <w:rPr>
-                <w:rFonts w:ascii="Arial" w:hAnsi="Arial" w:cs="Arial"/>
-                <w:b/>
-                <w:bCs/>
-                <w:sz w:val="16"/>
-                <w:szCs w:val="16"/>
-              </w:rPr>
-            </w:pPr>
-            <w:r>
-              <w:rPr>
-                <w:rFonts w:ascii="Arial" w:hAnsi="Arial" w:cs="Arial"/>
-                <w:b/>
-                <w:bCs/>
-                <w:sz w:val="16"/>
-                <w:szCs w:val="16"/>
-              </w:rPr>
-              <w:t>CRITÉRIOS</w:t>
-            </w:r>
-          </w:p>
-        </w:tc>
-        <w:tc>
-          <w:tcPr>
-            <w:tcBorders/>
-            <w:tcW w:w="2684" w:type="dxa"/>
+            <w:tcW w:w="3553" w:type="dxa"/>
             <w:vAlign w:val="center"/>
           </w:tcPr>
           <w:p ns2:paraId="6A4DEA23" ns2:textId="77777777">
@@ -8026,7 +8568,7 @@
         <w:tc>
           <w:tcPr>
             <w:tcBorders/>
-            <w:tcW w:w="4080" w:type="dxa"/>
+            <w:tcW w:w="5401" w:type="dxa"/>
             <w:vAlign w:val="center"/>
           </w:tcPr>
           <w:p ns2:paraId="4A1C29C4" ns2:textId="77777777">
@@ -8058,7 +8600,7 @@
         <w:tc>
           <w:tcPr>
             <w:tcBorders/>
-            <w:tcW w:w="4702" w:type="dxa"/>
+            <w:tcW w:w="6224" w:type="dxa"/>
             <w:vAlign w:val="center"/>
           </w:tcPr>
           <w:p ns2:paraId="357B1101" ns2:textId="77777777">
@@ -8093,7 +8635,7 @@
         <w:tc>
           <w:tcPr>
             <w:tcBorders/>
-            <w:tcW w:w="2259" w:type="dxa"/>
+            <w:tcW w:w="2991" w:type="dxa"/>
             <w:vAlign w:val="center"/>
           </w:tcPr>
           <w:p ns2:paraId="07477FA7" ns2:textId="4BBAC042">
@@ -8184,7 +8726,7 @@
         <w:tc>
           <w:tcPr>
             <w:tcBorders/>
-            <w:tcW w:w="3172" w:type="dxa"/>
+            <w:tcW w:w="4199" w:type="dxa"/>
             <w:vAlign w:val="center"/>
           </w:tcPr>
           <w:p ns2:paraId="1DD0E491" ns2:textId="77777777">
@@ -8276,7 +8818,7 @@
                 <w:sz w:val="18"/>
                 <w:szCs w:val="18"/>
               </w:rPr>
-              <w:t>IR4: Respostas quantitativas e qualitativas sobre o conhecimento, grau de utilização, utilidade prática e efetividade do guia "Os 6 passos para adequação à LGPD" no processo de adequação municipal; [F1, F3, F4, Q121, Q121[comment], Q122, Q123, Q125]</w:t>
+              <w:t>IR4: Respostas quantitativas e qualitativas sobre o conhecimento, grau de utilização, utilidade prática e efetividade do guia "Os 6 passos para adequação à LGPD" no processo de adequação municipal; [F1, F3, F4, Q121, Q122, Q123, Q125]</w:t>
             </w:r>
           </w:p>
           <w:p ns2:paraId="1DD0E491" ns2:textId="77777777">
@@ -8329,39 +8871,7 @@
         <w:tc>
           <w:tcPr>
             <w:tcBorders/>
-            <w:tcW w:w="5471" w:type="dxa"/>
-            <w:vAlign w:val="center"/>
-          </w:tcPr>
-          <w:p ns2:paraId="2667BB09" ns2:textId="2C1623C1">
-            <w:pPr>
-              <w:pStyle w:val="1010"/>
-              <w:pBdr/>
-              <w:spacing w:after="120"/>
-              <w:ind/>
-              <w:jc w:val="both"/>
-              <w:rPr>
-                <w:bCs/>
-                <w:color w:val="auto"/>
-                <w:sz w:val="18"/>
-                <w:szCs w:val="18"/>
-                <w:vertAlign w:val="superscript"/>
-              </w:rPr>
-            </w:pPr>
-            <w:r>
-              <w:rPr>
-                <w:bCs/>
-                <w:color w:val="auto"/>
-                <w:sz w:val="18"/>
-                <w:szCs w:val="18"/>
-              </w:rPr>
-              <w:t>Não se aplica como critério de conformidade: análise orientada pelas fontes e pelos procedimentos definidos.</w:t>
-            </w:r>
-          </w:p>
-        </w:tc>
-        <w:tc>
-          <w:tcPr>
-            <w:tcBorders/>
-            <w:tcW w:w="2684" w:type="dxa"/>
+            <w:tcW w:w="3553" w:type="dxa"/>
             <w:vAlign w:val="center"/>
           </w:tcPr>
           <w:p ns2:paraId="4C6E5B2E" ns2:textId="42100C78">
@@ -8512,7 +9022,7 @@
         <w:tc>
           <w:tcPr>
             <w:tcBorders/>
-            <w:tcW w:w="4080" w:type="dxa"/>
+            <w:tcW w:w="5401" w:type="dxa"/>
             <w:vAlign w:val="center"/>
           </w:tcPr>
           <w:p ns2:paraId="1E80855F" ns2:textId="1D853748">
@@ -8645,7 +9155,7 @@
         <w:tc>
           <w:tcPr>
             <w:tcBorders/>
-            <w:tcW w:w="4702" w:type="dxa"/>
+            <w:tcW w:w="6224" w:type="dxa"/>
             <w:vAlign w:val="center"/>
           </w:tcPr>
           <w:p ns2:paraId="11118515" ns2:textId="02403B9E">

</xml_diff>

<commit_message>
feat(auditoria-lgpd-2026): incluir justificativa condicional no survey
- adiciona a questão Q21just, exibida quando a prefeitura seleciona a alternativa A1 (Não se aplica) em Q21, para registrar os fundamentos da não aplicabilidade;

- ajusta as orientações de Q21 e a rastreabilidade da matriz de planejamento para contemplar a nova resposta textual;

- regenera o survey em LSS e DOCX e recompila a matriz de planejamento em DOCX;

- atualiza o README com a estrutura de execução e a documentação do fluxo condicional do questionário.
</commit_message>
<xml_diff>
--- a/01-Planejamento/02-Matriz_de_Planejamento/matriz_planejamento.docx
+++ b/01-Planejamento/02-Matriz_de_Planejamento/matriz_planejamento.docx
@@ -647,7 +647,7 @@
                 <w:sz w:val="18"/>
                 <w:szCs w:val="18"/>
               </w:rPr>
-              <w:t>IR1: Resposta sobre a execução de iniciativas preparatórias, a consideração dos encaminhamentos do Acórdão nº 3931/2025 e a elaboração e o registro do Plano de Ação determinado no item 1.1, acompanhada da comprovação documental do plano e do programa de governança em privacidade; [F1, F2, Q21, Q23, Q24, Q211evi, Q212evi]</w:t>
+              <w:t>IR1: Resposta sobre a execução de iniciativas preparatórias, justificativa de não aplicabilidade quando selecionada a alternativa A1, consideração dos encaminhamentos do Acórdão nº 3931/2025 e elaboração e o registro do Plano de Ação determinado no item 1.1, acompanhada da comprovação documental do plano e do programa de governança em privacidade; [F1, F2, Q21, Q21just, Q23, Q24, Q211evi, Q212evi]</w:t>
             </w:r>
           </w:p>
           <w:p ns2:paraId="1DD0E491" ns2:textId="77777777">
@@ -981,7 +981,7 @@
                 <w:sz w:val="18"/>
                 <w:szCs w:val="18"/>
               </w:rPr>
-              <w:t>P1: Verificar nas respostas às questões Q21, Q23 e Q24 se a organização declarou ter realizado iniciativas preparatórias, elaborado plano de ação ou programa de governança em privacidade, considerado os encaminhamentos aplicáveis do Acórdão nº 3931/2025 e elaborado e registrado o Plano de Ação no prazo determinado; [IR1]</w:t>
+              <w:t>P1: Verificar nas respostas às questões Q21, Q23 e Q24 e, quando Q21 = A1, na justificativa Q21just se a organização declarou ter realizado iniciativas preparatórias, elaborado plano de ação ou programa de governança em privacidade, considerado os encaminhamentos aplicáveis do Acórdão nº 3931/2025 e elaborado e registrado o Plano de Ação no prazo determinado; [IR1]</w:t>
             </w:r>
           </w:p>
           <w:p ns2:paraId="4C6E5B2E" ns2:textId="42100C78">
@@ -1129,7 +1129,7 @@
                 <w:sz w:val="18"/>
                 <w:szCs w:val="18"/>
               </w:rPr>
-              <w:t>E1: Registro das respostas às questões Q21, Q23 e Q24 sobre iniciativas preparatórias, plano de ação, programa de governança em privacidade, consideração dos encaminhamentos do Acórdão nº 3931/2025 e elaboração e registro do Plano de Ação determinado no item 1.1; [P1]</w:t>
+              <w:t>E1: Registro das respostas às questões Q21, Q23 e Q24 e, quando aplicável, da justificativa Q21just sobre iniciativas preparatórias, plano de ação, programa de governança em privacidade, consideração dos encaminhamentos do Acórdão nº 3931/2025 e elaboração e registro do Plano de Ação determinado no item 1.1; [P1]</w:t>
             </w:r>
           </w:p>
           <w:p ns2:paraId="1E80855F" ns2:textId="1D853748">

</xml_diff>